<commit_message>
addition of recommendation system to deep learning ANN script
</commit_message>
<xml_diff>
--- a/part3_machine_learning/3_Machine Learning Report.docx
+++ b/part3_machine_learning/3_Machine Learning Report.docx
@@ -281,7 +281,27 @@
           <w:szCs w:val="22"/>
           <w:lang w:val="en-IN"/>
         </w:rPr>
-        <w:t>A README explaining your project structure and how to run it, and stating clearly whether you sourced a real accident dataset or used a documented proxy.</w:t>
+        <w:t xml:space="preserve">A README explaining your project structure and how to run </w:t>
+      </w:r>
+      <w:proofErr w:type="gramStart"/>
+      <w:r>
+        <w:rPr>
+          <w:rFonts w:ascii="Times New Roman" w:hAnsi="Times New Roman" w:cs="Times New Roman"/>
+          <w:sz w:val="22"/>
+          <w:szCs w:val="22"/>
+          <w:lang w:val="en-IN"/>
+        </w:rPr>
+        <w:t>it, and</w:t>
+      </w:r>
+      <w:proofErr w:type="gramEnd"/>
+      <w:r>
+        <w:rPr>
+          <w:rFonts w:ascii="Times New Roman" w:hAnsi="Times New Roman" w:cs="Times New Roman"/>
+          <w:sz w:val="22"/>
+          <w:szCs w:val="22"/>
+          <w:lang w:val="en-IN"/>
+        </w:rPr>
+        <w:t xml:space="preserve"> stating clearly whether you sourced a real accident dataset or used a documented proxy.</w:t>
       </w:r>
       <w:r>
         <w:rPr>
@@ -321,6 +341,7 @@
           <w:bCs/>
           <w:sz w:val="22"/>
           <w:szCs w:val="22"/>
+          <w:u w:val="single"/>
           <w:lang w:val="en-PH"/>
         </w:rPr>
         <w:t>Task 1: Supervised Machine Learning Models</w:t>
@@ -339,114 +360,8 @@
       <w:r>
         <w:rPr>
           <w:rFonts w:ascii="Times New Roman" w:hAnsi="Times New Roman" w:cs="Times New Roman"/>
-          <w:sz w:val="22"/>
-          <w:szCs w:val="22"/>
-          <w:lang w:val="en-PH"/>
-        </w:rPr>
-        <w:t>Build two supervised machine learning models using the traffic volume dataset. Both models should use a common, well-engineered feature set that includes:</w:t>
-      </w:r>
-    </w:p>
-    <w:p>
-      <w:pPr>
-        <w:rPr>
-          <w:rFonts w:ascii="Times New Roman" w:hAnsi="Times New Roman" w:cs="Times New Roman"/>
-          <w:sz w:val="22"/>
-          <w:szCs w:val="22"/>
-          <w:lang w:val="en-PH"/>
-        </w:rPr>
-      </w:pPr>
-      <w:r>
-        <w:rPr>
-          <w:rFonts w:ascii="Times New Roman" w:hAnsi="Times New Roman" w:cs="Times New Roman"/>
-          <w:sz w:val="22"/>
-          <w:szCs w:val="22"/>
-          <w:lang w:val="en-PH"/>
-        </w:rPr>
-        <w:t>Compare the models using the following appropriate evaluation metrics:</w:t>
-      </w:r>
-    </w:p>
-    <w:p>
-      <w:pPr>
-        <w:pStyle w:val="ListParagraph"/>
-        <w:numPr>
-          <w:ilvl w:val="0"/>
-          <w:numId w:val="2"/>
-        </w:numPr>
-        <w:rPr>
-          <w:rFonts w:ascii="Times New Roman" w:hAnsi="Times New Roman" w:cs="Times New Roman"/>
-          <w:sz w:val="22"/>
-          <w:szCs w:val="22"/>
-          <w:lang w:val="en-PH"/>
-        </w:rPr>
-      </w:pPr>
-      <w:r>
-        <w:rPr>
-          <w:rFonts w:ascii="Times New Roman" w:hAnsi="Times New Roman" w:cs="Times New Roman"/>
           <w:b/>
           <w:bCs/>
-          <w:sz w:val="22"/>
-          <w:szCs w:val="22"/>
-          <w:lang w:val="en-PH"/>
-        </w:rPr>
-        <w:t>Regression</w:t>
-      </w:r>
-      <w:r>
-        <w:rPr>
-          <w:rFonts w:ascii="Times New Roman" w:hAnsi="Times New Roman" w:cs="Times New Roman"/>
-          <w:sz w:val="22"/>
-          <w:szCs w:val="22"/>
-          <w:lang w:val="en-PH"/>
-        </w:rPr>
-        <w:t xml:space="preserve">: MAE and R-squared </w:t>
-      </w:r>
-    </w:p>
-    <w:p>
-      <w:pPr>
-        <w:pStyle w:val="ListParagraph"/>
-        <w:numPr>
-          <w:ilvl w:val="0"/>
-          <w:numId w:val="2"/>
-        </w:numPr>
-        <w:rPr>
-          <w:rFonts w:ascii="Times New Roman" w:hAnsi="Times New Roman" w:cs="Times New Roman"/>
-          <w:sz w:val="22"/>
-          <w:szCs w:val="22"/>
-          <w:lang w:val="en-PH"/>
-        </w:rPr>
-      </w:pPr>
-      <w:r>
-        <w:rPr>
-          <w:rFonts w:ascii="Times New Roman" w:hAnsi="Times New Roman" w:cs="Times New Roman"/>
-          <w:b/>
-          <w:bCs/>
-          <w:sz w:val="22"/>
-          <w:szCs w:val="22"/>
-          <w:lang w:val="en-PH"/>
-        </w:rPr>
-        <w:t>Classification</w:t>
-      </w:r>
-      <w:r>
-        <w:rPr>
-          <w:rFonts w:ascii="Times New Roman" w:hAnsi="Times New Roman" w:cs="Times New Roman"/>
-          <w:sz w:val="22"/>
-          <w:szCs w:val="22"/>
-          <w:lang w:val="en-PH"/>
-        </w:rPr>
-        <w:t>: Accuracy, precision, recall, F1-score and ROC AUC</w:t>
-      </w:r>
-    </w:p>
-    <w:p>
-      <w:pPr>
-        <w:rPr>
-          <w:rFonts w:ascii="Times New Roman" w:hAnsi="Times New Roman" w:cs="Times New Roman"/>
-          <w:sz w:val="22"/>
-          <w:szCs w:val="22"/>
-          <w:lang w:val="en-PH"/>
-        </w:rPr>
-      </w:pPr>
-      <w:r>
-        <w:rPr>
-          <w:rFonts w:ascii="Times New Roman" w:hAnsi="Times New Roman" w:cs="Times New Roman"/>
           <w:sz w:val="22"/>
           <w:szCs w:val="22"/>
           <w:lang w:val="en-PH"/>
@@ -716,6 +631,8 @@
       <w:pPr>
         <w:rPr>
           <w:rFonts w:ascii="Times New Roman" w:hAnsi="Times New Roman" w:cs="Times New Roman"/>
+          <w:b/>
+          <w:bCs/>
           <w:sz w:val="22"/>
           <w:szCs w:val="22"/>
           <w:lang w:val="en-PH"/>
@@ -724,11 +641,43 @@
       <w:r>
         <w:rPr>
           <w:rFonts w:ascii="Times New Roman" w:hAnsi="Times New Roman" w:cs="Times New Roman"/>
+          <w:b/>
+          <w:bCs/>
           <w:sz w:val="22"/>
           <w:szCs w:val="22"/>
           <w:lang w:val="en-PH"/>
         </w:rPr>
         <w:t>Classification models</w:t>
+      </w:r>
+    </w:p>
+    <w:p>
+      <w:pPr>
+        <w:rPr>
+          <w:rFonts w:ascii="Times New Roman" w:hAnsi="Times New Roman" w:cs="Times New Roman"/>
+          <w:b/>
+          <w:bCs/>
+          <w:sz w:val="22"/>
+          <w:szCs w:val="22"/>
+          <w:lang w:val="en-PH"/>
+        </w:rPr>
+      </w:pPr>
+      <w:r>
+        <w:rPr>
+          <w:rFonts w:ascii="Times New Roman" w:hAnsi="Times New Roman" w:cs="Times New Roman"/>
+          <w:sz w:val="22"/>
+          <w:szCs w:val="22"/>
+          <w:lang w:val="en-PH"/>
+        </w:rPr>
+        <w:t xml:space="preserve">Estimate accident likelihood using the </w:t>
+      </w:r>
+      <w:r>
+        <w:rPr>
+          <w:rFonts w:ascii="Times New Roman" w:hAnsi="Times New Roman" w:cs="Times New Roman"/>
+          <w:sz w:val="22"/>
+          <w:szCs w:val="22"/>
+          <w:lang w:val="en-PH"/>
+        </w:rPr>
+        <w:t>accident risk proxy label.</w:t>
       </w:r>
     </w:p>
     <w:tbl>
@@ -817,7 +766,6 @@
           </w:tcPr>
           <w:p>
             <w:r>
-              <w:lastRenderedPageBreak/>
               <w:t>Precision</w:t>
             </w:r>
           </w:p>
@@ -956,6 +904,7 @@
           <w:bCs/>
           <w:lang w:val="en-SG"/>
         </w:rPr>
+        <w:lastRenderedPageBreak/>
         <w:t>Accuracy (0.99 for both):</w:t>
       </w:r>
       <w:r>
@@ -1073,213 +1022,178 @@
       </w:pPr>
       <w:r>
         <w:rPr>
+          <w:lang w:val="en-SG"/>
+        </w:rPr>
+        <w:t>The</w:t>
+      </w:r>
+      <w:r>
+        <w:rPr>
+          <w:lang w:val="en-SG"/>
+        </w:rPr>
+        <w:t xml:space="preserve"> accuracy of 0.99 is excellent, but </w:t>
+      </w:r>
+      <w:proofErr w:type="spellStart"/>
+      <w:r>
+        <w:rPr>
+          <w:lang w:val="en-SG"/>
+        </w:rPr>
+        <w:t>the</w:t>
+      </w:r>
+      <w:proofErr w:type="spellEnd"/>
+      <w:r>
+        <w:rPr>
+          <w:lang w:val="en-SG"/>
+        </w:rPr>
+        <w:t xml:space="preserve"> scores</w:t>
+      </w:r>
+      <w:r>
+        <w:rPr>
+          <w:lang w:val="en-SG"/>
+        </w:rPr>
+        <w:t xml:space="preserve"> are unexpectedly high</w:t>
+      </w:r>
+      <w:r>
+        <w:rPr>
+          <w:lang w:val="en-SG"/>
+        </w:rPr>
+        <w:t xml:space="preserve">, this is likely </w:t>
+      </w:r>
+      <w:proofErr w:type="gramStart"/>
+      <w:r>
+        <w:rPr>
+          <w:lang w:val="en-SG"/>
+        </w:rPr>
+        <w:t>due to the fact that</w:t>
+      </w:r>
+      <w:proofErr w:type="gramEnd"/>
+      <w:r>
+        <w:rPr>
+          <w:lang w:val="en-SG"/>
+        </w:rPr>
+        <w:t xml:space="preserve"> the proxy accident risk label is directly derived from the other </w:t>
+      </w:r>
+      <w:r>
+        <w:rPr>
+          <w:lang w:val="en-SG"/>
+        </w:rPr>
+        <w:t xml:space="preserve">variables in the dataset. </w:t>
+      </w:r>
+    </w:p>
+    <w:p/>
+    <w:p>
+      <w:pPr>
+        <w:rPr>
+          <w:rFonts w:ascii="Times New Roman" w:hAnsi="Times New Roman" w:cs="Times New Roman"/>
           <w:b/>
           <w:bCs/>
-          <w:lang w:val="en-SG"/>
-        </w:rPr>
-        <w:t>I would recommend SVM</w:t>
-      </w:r>
-      <w:r>
-        <w:rPr>
-          <w:lang w:val="en-SG"/>
-        </w:rPr>
-        <w:t>, based on the results you provided.</w:t>
+          <w:sz w:val="22"/>
+          <w:szCs w:val="22"/>
+          <w:u w:val="single"/>
+          <w:lang w:val="en-PH"/>
+        </w:rPr>
+      </w:pPr>
+      <w:r>
+        <w:rPr>
+          <w:rFonts w:ascii="Times New Roman" w:hAnsi="Times New Roman" w:cs="Times New Roman"/>
+          <w:b/>
+          <w:bCs/>
+          <w:sz w:val="22"/>
+          <w:szCs w:val="22"/>
+          <w:u w:val="single"/>
+          <w:lang w:val="en-PH"/>
+        </w:rPr>
+        <w:t>Task 2: Unsupervised Machine Learning</w:t>
       </w:r>
     </w:p>
     <w:p>
       <w:pPr>
-        <w:numPr>
-          <w:ilvl w:val="0"/>
-          <w:numId w:val="9"/>
-        </w:numPr>
-        <w:rPr>
-          <w:lang w:val="en-SG"/>
-        </w:rPr>
-      </w:pPr>
-      <w:r>
-        <w:rPr>
-          <w:lang w:val="en-SG"/>
-        </w:rPr>
-        <w:t>It has higher precision, recall, F1 score, and ROC AUC.</w:t>
+        <w:rPr>
+          <w:rFonts w:ascii="Times New Roman" w:hAnsi="Times New Roman" w:cs="Times New Roman"/>
+          <w:b/>
+          <w:bCs/>
+          <w:sz w:val="22"/>
+          <w:szCs w:val="22"/>
+          <w:lang w:val="en-PH"/>
+        </w:rPr>
+      </w:pPr>
+      <w:r>
+        <w:rPr>
+          <w:rFonts w:ascii="Times New Roman" w:hAnsi="Times New Roman" w:cs="Times New Roman"/>
+          <w:b/>
+          <w:bCs/>
+          <w:sz w:val="22"/>
+          <w:szCs w:val="22"/>
+          <w:lang w:val="en-PH"/>
+        </w:rPr>
+        <w:t>K means clustering</w:t>
       </w:r>
     </w:p>
     <w:p>
       <w:pPr>
-        <w:numPr>
-          <w:ilvl w:val="0"/>
-          <w:numId w:val="9"/>
-        </w:numPr>
-        <w:rPr>
-          <w:lang w:val="en-SG"/>
-        </w:rPr>
-      </w:pPr>
-      <w:r>
-        <w:rPr>
-          <w:lang w:val="en-SG"/>
-        </w:rPr>
-        <w:t>It offers slightly better classification performance while maintaining the same reported accuracy as Logistic Regression.</w:t>
+        <w:rPr>
+          <w:rFonts w:ascii="Times New Roman" w:hAnsi="Times New Roman" w:cs="Times New Roman"/>
+          <w:sz w:val="22"/>
+          <w:szCs w:val="22"/>
+          <w:lang w:val="en-SG"/>
+        </w:rPr>
+      </w:pPr>
+      <w:r>
+        <w:rPr>
+          <w:rFonts w:ascii="Times New Roman" w:hAnsi="Times New Roman" w:cs="Times New Roman"/>
+          <w:sz w:val="22"/>
+          <w:szCs w:val="22"/>
+          <w:lang w:val="en-SG"/>
+        </w:rPr>
+        <w:t>K-means clustering was performed using features</w:t>
+      </w:r>
+      <w:r>
+        <w:rPr>
+          <w:rFonts w:ascii="Times New Roman" w:hAnsi="Times New Roman" w:cs="Times New Roman"/>
+          <w:sz w:val="22"/>
+          <w:szCs w:val="22"/>
+          <w:lang w:val="en-SG"/>
+        </w:rPr>
+        <w:t xml:space="preserve"> such as</w:t>
+      </w:r>
+      <w:r>
+        <w:rPr>
+          <w:rFonts w:ascii="Times New Roman" w:hAnsi="Times New Roman" w:cs="Times New Roman"/>
+          <w:sz w:val="22"/>
+          <w:szCs w:val="22"/>
+          <w:lang w:val="en-SG"/>
+        </w:rPr>
+        <w:t xml:space="preserve"> weather condition, temperature, hour of the day, traffic volume, holiday status, and weekday/weekend status. The Within-Cluster Sum of Squares (WCSS) method was used to determine the optimal number of clusters, </w:t>
+      </w:r>
+      <w:r>
+        <w:rPr>
+          <w:rFonts w:ascii="Times New Roman" w:hAnsi="Times New Roman" w:cs="Times New Roman"/>
+          <w:sz w:val="22"/>
+          <w:szCs w:val="22"/>
+          <w:lang w:val="en-SG"/>
+        </w:rPr>
+        <w:t>with three clusters</w:t>
+      </w:r>
+      <w:r>
+        <w:rPr>
+          <w:rFonts w:ascii="Times New Roman" w:hAnsi="Times New Roman" w:cs="Times New Roman"/>
+          <w:sz w:val="22"/>
+          <w:szCs w:val="22"/>
+          <w:lang w:val="en-SG"/>
+        </w:rPr>
+        <w:t xml:space="preserve"> identified as the most suitable choice.</w:t>
+      </w:r>
+      <w:r>
+        <w:rPr>
+          <w:rFonts w:ascii="Times New Roman" w:hAnsi="Times New Roman" w:cs="Times New Roman"/>
+          <w:sz w:val="22"/>
+          <w:szCs w:val="22"/>
+          <w:lang w:val="en-SG"/>
+        </w:rPr>
+        <w:t xml:space="preserve"> </w:t>
       </w:r>
     </w:p>
     <w:p>
       <w:pPr>
-        <w:numPr>
-          <w:ilvl w:val="0"/>
-          <w:numId w:val="9"/>
-        </w:numPr>
-        <w:rPr>
-          <w:lang w:val="en-SG"/>
-        </w:rPr>
-      </w:pPr>
-      <w:r>
-        <w:rPr>
-          <w:lang w:val="en-SG"/>
-        </w:rPr>
-        <w:t>Logistic Regression remains a useful alternative if interpretability and explaining how features relate to predictions are important.</w:t>
-      </w:r>
-    </w:p>
-    <w:p>
-      <w:pPr>
-        <w:rPr>
-          <w:lang w:val="en-SG"/>
-        </w:rPr>
-      </w:pPr>
-      <w:r>
-        <w:rPr>
-          <w:lang w:val="en-SG"/>
-        </w:rPr>
-        <w:t xml:space="preserve">One caution: an accuracy of 0.99 is excellent, but check for </w:t>
-      </w:r>
-      <w:r>
-        <w:rPr>
-          <w:b/>
-          <w:bCs/>
-          <w:lang w:val="en-SG"/>
-        </w:rPr>
-        <w:t>data leakage</w:t>
-      </w:r>
-      <w:r>
-        <w:rPr>
-          <w:lang w:val="en-SG"/>
-        </w:rPr>
-        <w:t>, class imbalance, and whether both models were evaluated on the same unseen test set. If the scores are unexpectedly high, these checks are especially important.</w:t>
-      </w:r>
-    </w:p>
-    <w:p/>
-    <w:p/>
-    <w:p>
-      <w:pPr>
-        <w:rPr>
-          <w:rFonts w:ascii="Times New Roman" w:hAnsi="Times New Roman" w:cs="Times New Roman"/>
-          <w:b/>
-          <w:bCs/>
-          <w:sz w:val="22"/>
-          <w:szCs w:val="22"/>
-          <w:u w:val="single"/>
-          <w:lang w:val="en-PH"/>
-        </w:rPr>
-      </w:pPr>
-      <w:r>
-        <w:rPr>
-          <w:rFonts w:ascii="Times New Roman" w:hAnsi="Times New Roman" w:cs="Times New Roman"/>
-          <w:b/>
-          <w:bCs/>
-          <w:sz w:val="22"/>
-          <w:szCs w:val="22"/>
-          <w:u w:val="single"/>
-          <w:lang w:val="en-PH"/>
-        </w:rPr>
-        <w:t>Task 2: Unsupervised Machine Learning</w:t>
-      </w:r>
-    </w:p>
-    <w:p>
-      <w:pPr>
-        <w:rPr>
-          <w:rFonts w:ascii="Times New Roman" w:hAnsi="Times New Roman" w:cs="Times New Roman"/>
-          <w:b/>
-          <w:bCs/>
-          <w:sz w:val="22"/>
-          <w:szCs w:val="22"/>
-          <w:lang w:val="en-PH"/>
-        </w:rPr>
-      </w:pPr>
-      <w:r>
-        <w:rPr>
-          <w:rFonts w:ascii="Times New Roman" w:hAnsi="Times New Roman" w:cs="Times New Roman"/>
-          <w:b/>
-          <w:bCs/>
-          <w:sz w:val="22"/>
-          <w:szCs w:val="22"/>
-          <w:lang w:val="en-PH"/>
-        </w:rPr>
-        <w:t>K means clustering</w:t>
-      </w:r>
-    </w:p>
-    <w:p>
-      <w:pPr>
-        <w:rPr>
-          <w:rFonts w:ascii="Times New Roman" w:hAnsi="Times New Roman" w:cs="Times New Roman"/>
-          <w:sz w:val="22"/>
-          <w:szCs w:val="22"/>
-          <w:lang w:val="en-SG"/>
-        </w:rPr>
-      </w:pPr>
-      <w:r>
-        <w:rPr>
-          <w:rFonts w:ascii="Times New Roman" w:hAnsi="Times New Roman" w:cs="Times New Roman"/>
-          <w:sz w:val="22"/>
-          <w:szCs w:val="22"/>
-          <w:lang w:val="en-SG"/>
-        </w:rPr>
-        <w:t>K-means clustering was performed using features</w:t>
-      </w:r>
-      <w:r>
-        <w:rPr>
-          <w:rFonts w:ascii="Times New Roman" w:hAnsi="Times New Roman" w:cs="Times New Roman"/>
-          <w:sz w:val="22"/>
-          <w:szCs w:val="22"/>
-          <w:lang w:val="en-SG"/>
-        </w:rPr>
-        <w:t xml:space="preserve"> such as</w:t>
-      </w:r>
-      <w:r>
-        <w:rPr>
-          <w:rFonts w:ascii="Times New Roman" w:hAnsi="Times New Roman" w:cs="Times New Roman"/>
-          <w:sz w:val="22"/>
-          <w:szCs w:val="22"/>
-          <w:lang w:val="en-SG"/>
-        </w:rPr>
-        <w:t xml:space="preserve"> weather condition, temperature, hour of the day, traffic volume, holiday status, and weekday/weekend status. The Within-Cluster Sum of Squares (WCSS) method was used to determine the optimal number of clusters, </w:t>
-      </w:r>
-      <w:r>
-        <w:rPr>
-          <w:rFonts w:ascii="Times New Roman" w:hAnsi="Times New Roman" w:cs="Times New Roman"/>
-          <w:sz w:val="22"/>
-          <w:szCs w:val="22"/>
-          <w:lang w:val="en-SG"/>
-        </w:rPr>
-        <w:t>with three clusters</w:t>
-      </w:r>
-      <w:r>
-        <w:rPr>
-          <w:rFonts w:ascii="Times New Roman" w:hAnsi="Times New Roman" w:cs="Times New Roman"/>
-          <w:sz w:val="22"/>
-          <w:szCs w:val="22"/>
-          <w:lang w:val="en-SG"/>
-        </w:rPr>
-        <w:t xml:space="preserve"> identified as the most suitable choice.</w:t>
-      </w:r>
-      <w:r>
-        <w:rPr>
-          <w:rFonts w:ascii="Times New Roman" w:hAnsi="Times New Roman" w:cs="Times New Roman"/>
-          <w:sz w:val="22"/>
-          <w:szCs w:val="22"/>
-          <w:lang w:val="en-SG"/>
-        </w:rPr>
-        <w:t xml:space="preserve"> </w:t>
-      </w:r>
-    </w:p>
-    <w:p>
-      <w:pPr>
         <w:rPr>
           <w:rFonts w:ascii="Times New Roman" w:hAnsi="Times New Roman" w:cs="Times New Roman"/>
           <w:sz w:val="22"/>
@@ -1330,17 +1244,7 @@
           <w:szCs w:val="22"/>
           <w:lang w:val="en-SG"/>
         </w:rPr>
-        <w:t xml:space="preserve">lar, the plots of hour and traffic volume reveal </w:t>
-      </w:r>
-      <w:r>
-        <w:rPr>
-          <w:rFonts w:ascii="Times New Roman" w:hAnsi="Times New Roman" w:cs="Times New Roman"/>
-          <w:sz w:val="22"/>
-          <w:szCs w:val="22"/>
-          <w:lang w:val="en-SG"/>
-        </w:rPr>
-        <w:lastRenderedPageBreak/>
-        <w:t>relatively distinct patterns, indicating that the clusters are strongly associated with different levels of traffic volume at specific times of the day.</w:t>
+        <w:t>lar, the plots of hour and traffic volume reveal relatively distinct patterns, indicating that the clusters are strongly associated with different levels of traffic volume at specific times of the day.</w:t>
       </w:r>
     </w:p>
     <w:p>
@@ -1495,6 +1399,7 @@
           <w:szCs w:val="22"/>
           <w:lang w:val="en-SG"/>
         </w:rPr>
+        <w:lastRenderedPageBreak/>
         <w:t>Cluster 1 – Moderate traffic volume:</w:t>
       </w:r>
       <w:r>
@@ -1538,7 +1443,27 @@
           <w:szCs w:val="22"/>
           <w:lang w:val="en-SG"/>
         </w:rPr>
-        <w:t xml:space="preserve"> This cluster is characterised by traffic volumes exceeding approximately 4,000, occurring mainly around 5 a.m. and between 7 p.m. and 11 p.m.</w:t>
+        <w:t xml:space="preserve"> This cluster is characterised by traffic volumes </w:t>
+      </w:r>
+      <w:proofErr w:type="gramStart"/>
+      <w:r>
+        <w:rPr>
+          <w:rFonts w:ascii="Times New Roman" w:hAnsi="Times New Roman" w:cs="Times New Roman"/>
+          <w:sz w:val="22"/>
+          <w:szCs w:val="22"/>
+          <w:lang w:val="en-SG"/>
+        </w:rPr>
+        <w:t>exceeding</w:t>
+      </w:r>
+      <w:proofErr w:type="gramEnd"/>
+      <w:r>
+        <w:rPr>
+          <w:rFonts w:ascii="Times New Roman" w:hAnsi="Times New Roman" w:cs="Times New Roman"/>
+          <w:sz w:val="22"/>
+          <w:szCs w:val="22"/>
+          <w:lang w:val="en-SG"/>
+        </w:rPr>
+        <w:t xml:space="preserve"> approximately 4,000, occurring mainly around 5 a.m. and between 7 p.m. and 11 p.m.</w:t>
       </w:r>
     </w:p>
     <w:p>
@@ -2779,7 +2704,6 @@
                 <w:szCs w:val="22"/>
                 <w:lang w:val="en-SG"/>
               </w:rPr>
-              <w:lastRenderedPageBreak/>
               <w:t xml:space="preserve">Weekend </w:t>
             </w:r>
             <w:r>
@@ -3183,6 +3107,7 @@
           <w:szCs w:val="22"/>
           <w:lang w:val="en-SG"/>
         </w:rPr>
+        <w:lastRenderedPageBreak/>
         <w:t>Interpretation: About 2.07% of all observations satisfy all four conditions: morning rush hour, weekday, mist, and high congestion. Among all morning rush-hour observations, 12.07% contain the other three conditions together.</w:t>
       </w:r>
     </w:p>
@@ -3221,7 +3146,27 @@
           <w:szCs w:val="22"/>
           <w:lang w:val="en-SG"/>
         </w:rPr>
-        <w:t>What it means: Morning rush hours are associated with the combined pattern of weekdays, mist, and high congestion. This is similar to Rule 1, but th</w:t>
+        <w:t xml:space="preserve">What it means: Morning rush hours are associated with the combined pattern of weekdays, mist, and high congestion. This is </w:t>
+      </w:r>
+      <w:proofErr w:type="gramStart"/>
+      <w:r>
+        <w:rPr>
+          <w:rFonts w:ascii="Times New Roman" w:hAnsi="Times New Roman" w:cs="Times New Roman"/>
+          <w:sz w:val="22"/>
+          <w:szCs w:val="22"/>
+          <w:lang w:val="en-SG"/>
+        </w:rPr>
+        <w:t>similar to</w:t>
+      </w:r>
+      <w:proofErr w:type="gramEnd"/>
+      <w:r>
+        <w:rPr>
+          <w:rFonts w:ascii="Times New Roman" w:hAnsi="Times New Roman" w:cs="Times New Roman"/>
+          <w:sz w:val="22"/>
+          <w:szCs w:val="22"/>
+          <w:lang w:val="en-SG"/>
+        </w:rPr>
+        <w:t xml:space="preserve"> Rule 1, but th</w:t>
       </w:r>
       <w:r>
         <w:rPr>
@@ -3503,7 +3448,6 @@
           <w:u w:val="single"/>
           <w:lang w:val="en-PH"/>
         </w:rPr>
-        <w:lastRenderedPageBreak/>
         <w:t>Task 3: Deep Learning with Explainability</w:t>
       </w:r>
     </w:p>
@@ -3584,6 +3528,7 @@
           <w:szCs w:val="22"/>
           <w:lang w:val="en-SG"/>
         </w:rPr>
+        <w:lastRenderedPageBreak/>
         <w:drawing>
           <wp:inline distT="0" distB="0" distL="0" distR="0" wp14:anchorId="054CB6D0" wp14:editId="73C110FA">
             <wp:extent cx="2427245" cy="2108200"/>
@@ -3951,7 +3896,6 @@
           <w:szCs w:val="22"/>
           <w:lang w:val="en-SG"/>
         </w:rPr>
-        <w:lastRenderedPageBreak/>
         <w:t>Weekend indicator (</w:t>
       </w:r>
       <w:proofErr w:type="spellStart"/>
@@ -4143,6 +4087,7 @@
           <w:szCs w:val="22"/>
           <w:lang w:val="en-SG"/>
         </w:rPr>
+        <w:lastRenderedPageBreak/>
         <w:t>SHAP was used to improve model interpretability by identifying the features most influential in its predictions. However, feature importance indicates predictive associations rather than causation.</w:t>
       </w:r>
     </w:p>
@@ -4393,6 +4338,26 @@
       <w:pPr>
         <w:rPr>
           <w:rFonts w:ascii="Times New Roman" w:hAnsi="Times New Roman" w:cs="Times New Roman"/>
+          <w:sz w:val="22"/>
+          <w:szCs w:val="22"/>
+          <w:lang w:val="en-PH"/>
+        </w:rPr>
+      </w:pPr>
+    </w:p>
+    <w:p>
+      <w:pPr>
+        <w:rPr>
+          <w:rFonts w:ascii="Times New Roman" w:hAnsi="Times New Roman" w:cs="Times New Roman"/>
+          <w:sz w:val="22"/>
+          <w:szCs w:val="22"/>
+          <w:lang w:val="en-PH"/>
+        </w:rPr>
+      </w:pPr>
+    </w:p>
+    <w:p>
+      <w:pPr>
+        <w:rPr>
+          <w:rFonts w:ascii="Times New Roman" w:hAnsi="Times New Roman" w:cs="Times New Roman"/>
           <w:b/>
           <w:bCs/>
           <w:sz w:val="22"/>
@@ -4420,48 +4385,35 @@
           <w:rFonts w:ascii="Times New Roman" w:hAnsi="Times New Roman" w:cs="Times New Roman"/>
           <w:sz w:val="22"/>
           <w:szCs w:val="22"/>
-          <w:lang w:val="en-PH"/>
-        </w:rPr>
-      </w:pPr>
-      <w:r>
-        <w:rPr>
-          <w:rFonts w:ascii="Times New Roman" w:hAnsi="Times New Roman" w:cs="Times New Roman"/>
-          <w:sz w:val="22"/>
-          <w:szCs w:val="22"/>
-          <w:lang w:val="en-PH"/>
-        </w:rPr>
-        <w:t xml:space="preserve">Transform the analysis and model outputs into a practical </w:t>
-      </w:r>
-      <w:r>
-        <w:rPr>
-          <w:rFonts w:ascii="Times New Roman" w:hAnsi="Times New Roman" w:cs="Times New Roman"/>
-          <w:b/>
-          <w:bCs/>
-          <w:sz w:val="22"/>
-          <w:szCs w:val="22"/>
-          <w:lang w:val="en-PH"/>
-        </w:rPr>
-        <w:t xml:space="preserve">Route </w:t>
-      </w:r>
-      <w:r>
-        <w:rPr>
-          <w:rFonts w:ascii="Times New Roman" w:hAnsi="Times New Roman" w:cs="Times New Roman"/>
-          <w:b/>
-          <w:bCs/>
-          <w:sz w:val="22"/>
-          <w:szCs w:val="22"/>
-          <w:lang w:val="en-PH"/>
-        </w:rPr>
-        <w:t>Recommendation System</w:t>
-      </w:r>
-      <w:r>
-        <w:rPr>
-          <w:rFonts w:ascii="Times New Roman" w:hAnsi="Times New Roman" w:cs="Times New Roman"/>
-          <w:sz w:val="22"/>
-          <w:szCs w:val="22"/>
-          <w:lang w:val="en-PH"/>
-        </w:rPr>
-        <w:t>.</w:t>
+          <w:lang w:val="en-SG"/>
+        </w:rPr>
+      </w:pPr>
+      <w:r>
+        <w:rPr>
+          <w:rFonts w:ascii="Times New Roman" w:hAnsi="Times New Roman" w:cs="Times New Roman"/>
+          <w:sz w:val="22"/>
+          <w:szCs w:val="22"/>
+          <w:lang w:val="en-SG"/>
+        </w:rPr>
+        <w:t xml:space="preserve">The Recommendation System was developed using the trained Artificial Neural Network (ANN) model </w:t>
+      </w:r>
+      <w:r>
+        <w:rPr>
+          <w:rFonts w:ascii="Times New Roman" w:hAnsi="Times New Roman" w:cs="Times New Roman"/>
+          <w:sz w:val="22"/>
+          <w:szCs w:val="22"/>
+          <w:lang w:val="en-SG"/>
+        </w:rPr>
+        <w:t xml:space="preserve">in Task 3 </w:t>
+      </w:r>
+      <w:r>
+        <w:rPr>
+          <w:rFonts w:ascii="Times New Roman" w:hAnsi="Times New Roman" w:cs="Times New Roman"/>
+          <w:sz w:val="22"/>
+          <w:szCs w:val="22"/>
+          <w:lang w:val="en-SG"/>
+        </w:rPr>
+        <w:t>to identify suitable travel times based on predicted traffic volume along the selected road corridor. The system incorporates historical traffic and weather data, including time of day, day of the week, weekend indicators, and weather conditions. The ANN generates traffic volume predictions, which are then grouped by hour and evaluated under different day types and weather conditions. By comparing the average predicted traffic volume across these time periods, the system identifies the hours expected to experience relatively lower traffic. As the dataset covers only one road corridor, the system focuses on recommending travel times rather than selecting alternative routes.</w:t>
       </w:r>
     </w:p>
     <w:p>
@@ -4470,55 +4422,17 @@
           <w:rFonts w:ascii="Times New Roman" w:hAnsi="Times New Roman" w:cs="Times New Roman"/>
           <w:sz w:val="22"/>
           <w:szCs w:val="22"/>
-          <w:lang w:val="en-PH"/>
-        </w:rPr>
-      </w:pPr>
-      <w:r>
-        <w:rPr>
-          <w:rFonts w:ascii="Times New Roman" w:hAnsi="Times New Roman" w:cs="Times New Roman"/>
-          <w:sz w:val="22"/>
-          <w:szCs w:val="22"/>
-          <w:lang w:val="en-PH"/>
-        </w:rPr>
-        <w:t xml:space="preserve">Because the dataset represents a single corridor, the system should focus on </w:t>
-      </w:r>
-      <w:r>
-        <w:rPr>
-          <w:rFonts w:ascii="Times New Roman" w:hAnsi="Times New Roman" w:cs="Times New Roman"/>
-          <w:b/>
-          <w:bCs/>
-          <w:sz w:val="22"/>
-          <w:szCs w:val="22"/>
-          <w:lang w:val="en-PH"/>
-        </w:rPr>
-        <w:t>travel timing rather than route selection</w:t>
-      </w:r>
-      <w:r>
-        <w:rPr>
-          <w:rFonts w:ascii="Times New Roman" w:hAnsi="Times New Roman" w:cs="Times New Roman"/>
-          <w:sz w:val="22"/>
-          <w:szCs w:val="22"/>
-          <w:lang w:val="en-PH"/>
-        </w:rPr>
-        <w:t xml:space="preserve">, unless </w:t>
-      </w:r>
-      <w:r>
-        <w:rPr>
-          <w:rFonts w:ascii="Times New Roman" w:hAnsi="Times New Roman" w:cs="Times New Roman"/>
-          <w:sz w:val="22"/>
-          <w:szCs w:val="22"/>
-          <w:lang w:val="en-PH"/>
-        </w:rPr>
-        <w:t>you</w:t>
-      </w:r>
-      <w:r>
-        <w:rPr>
-          <w:rFonts w:ascii="Times New Roman" w:hAnsi="Times New Roman" w:cs="Times New Roman"/>
-          <w:sz w:val="22"/>
-          <w:szCs w:val="22"/>
-          <w:lang w:val="en-PH"/>
-        </w:rPr>
-        <w:t xml:space="preserve"> introduce additional route data. </w:t>
+          <w:lang w:val="en-SG"/>
+        </w:rPr>
+      </w:pPr>
+      <w:r>
+        <w:rPr>
+          <w:rFonts w:ascii="Times New Roman" w:hAnsi="Times New Roman" w:cs="Times New Roman"/>
+          <w:sz w:val="22"/>
+          <w:szCs w:val="22"/>
+          <w:lang w:val="en-SG"/>
+        </w:rPr>
+        <w:t>The system allows users to specify their intended day type (weekday or weekend) and weather condition (such as clear, cloudy, or rainy) to receive a personalised travel time recommendation. Based on the available historical observations, it identifies the hour with the lowest average predicted traffic volume and presents a plain-language recommendation, together with the predicted traffic level and the number of supporting observations. This enables users to make more informed decisions about when to travel, potentially helping them avoid busier periods. However, the recommendations are based on historical patterns and model predictions rather than real-time traffic conditions, so they should be treated as guidance rather than a guarantee of reduced congestion or shorter journey times.</w:t>
       </w:r>
     </w:p>
     <w:p>
@@ -4537,141 +4451,41 @@
           <w:szCs w:val="22"/>
           <w:lang w:val="en-PH"/>
         </w:rPr>
-        <w:t>The system should:</w:t>
-      </w:r>
-    </w:p>
-    <w:p>
-      <w:pPr>
-        <w:pStyle w:val="ListParagraph"/>
-        <w:numPr>
-          <w:ilvl w:val="0"/>
-          <w:numId w:val="19"/>
-        </w:numPr>
-        <w:rPr>
-          <w:rFonts w:ascii="Times New Roman" w:hAnsi="Times New Roman" w:cs="Times New Roman"/>
-          <w:sz w:val="22"/>
-          <w:szCs w:val="22"/>
-          <w:lang w:val="en-PH"/>
-        </w:rPr>
-      </w:pPr>
-      <w:r>
-        <w:rPr>
-          <w:rFonts w:ascii="Times New Roman" w:hAnsi="Times New Roman" w:cs="Times New Roman"/>
-          <w:sz w:val="22"/>
-          <w:szCs w:val="22"/>
-          <w:lang w:val="en-PH"/>
-        </w:rPr>
-        <w:t>Identify lower-traffic travel periods</w:t>
-      </w:r>
-    </w:p>
-    <w:p>
-      <w:pPr>
-        <w:pStyle w:val="ListParagraph"/>
-        <w:numPr>
-          <w:ilvl w:val="0"/>
-          <w:numId w:val="19"/>
-        </w:numPr>
-        <w:rPr>
-          <w:rFonts w:ascii="Times New Roman" w:hAnsi="Times New Roman" w:cs="Times New Roman"/>
-          <w:sz w:val="22"/>
-          <w:szCs w:val="22"/>
-          <w:lang w:val="en-PH"/>
-        </w:rPr>
-      </w:pPr>
-      <w:r>
-        <w:rPr>
-          <w:rFonts w:ascii="Times New Roman" w:hAnsi="Times New Roman" w:cs="Times New Roman"/>
-          <w:sz w:val="22"/>
-          <w:szCs w:val="22"/>
-          <w:lang w:val="en-PH"/>
-        </w:rPr>
-        <w:t>Consider day type and weather conditions where appropriate</w:t>
-      </w:r>
-    </w:p>
-    <w:p>
-      <w:pPr>
-        <w:pStyle w:val="ListParagraph"/>
-        <w:numPr>
-          <w:ilvl w:val="0"/>
-          <w:numId w:val="19"/>
-        </w:numPr>
-        <w:rPr>
-          <w:rFonts w:ascii="Times New Roman" w:hAnsi="Times New Roman" w:cs="Times New Roman"/>
-          <w:sz w:val="22"/>
-          <w:szCs w:val="22"/>
-          <w:lang w:val="en-PH"/>
-        </w:rPr>
-      </w:pPr>
-      <w:r>
-        <w:rPr>
-          <w:rFonts w:ascii="Times New Roman" w:hAnsi="Times New Roman" w:cs="Times New Roman"/>
-          <w:sz w:val="22"/>
-          <w:szCs w:val="22"/>
-          <w:lang w:val="en-PH"/>
-        </w:rPr>
-        <w:t>Recommend suitable travel windows</w:t>
-      </w:r>
-    </w:p>
-    <w:p>
-      <w:pPr>
-        <w:pStyle w:val="ListParagraph"/>
-        <w:numPr>
-          <w:ilvl w:val="0"/>
-          <w:numId w:val="19"/>
-        </w:numPr>
-        <w:rPr>
-          <w:rFonts w:ascii="Times New Roman" w:hAnsi="Times New Roman" w:cs="Times New Roman"/>
-          <w:sz w:val="22"/>
-          <w:szCs w:val="22"/>
-          <w:lang w:val="en-PH"/>
-        </w:rPr>
-      </w:pPr>
-      <w:r>
-        <w:rPr>
-          <w:rFonts w:ascii="Times New Roman" w:hAnsi="Times New Roman" w:cs="Times New Roman"/>
-          <w:sz w:val="22"/>
-          <w:szCs w:val="22"/>
-          <w:lang w:val="en-PH"/>
-        </w:rPr>
-        <w:t>Generate a plain-language recommendation</w:t>
-      </w:r>
-    </w:p>
-    <w:p>
-      <w:pPr>
-        <w:rPr>
-          <w:rFonts w:ascii="Times New Roman" w:hAnsi="Times New Roman" w:cs="Times New Roman"/>
-          <w:sz w:val="22"/>
-          <w:szCs w:val="22"/>
-          <w:lang w:val="en-PH"/>
-        </w:rPr>
-      </w:pPr>
-      <w:r>
-        <w:rPr>
-          <w:rFonts w:ascii="Times New Roman" w:hAnsi="Times New Roman" w:cs="Times New Roman"/>
-          <w:sz w:val="22"/>
-          <w:szCs w:val="22"/>
-          <w:lang w:val="en-PH"/>
-        </w:rPr>
-        <w:t>For example:</w:t>
-      </w:r>
-    </w:p>
-    <w:p>
-      <w:pPr>
-        <w:rPr>
-          <w:rFonts w:ascii="Times New Roman" w:hAnsi="Times New Roman" w:cs="Times New Roman"/>
-          <w:sz w:val="22"/>
-          <w:szCs w:val="22"/>
-          <w:lang w:val="en-PH"/>
-        </w:rPr>
-      </w:pPr>
-      <w:r>
-        <w:rPr>
-          <w:rFonts w:ascii="Times New Roman" w:hAnsi="Times New Roman" w:cs="Times New Roman"/>
-          <w:sz w:val="22"/>
-          <w:szCs w:val="22"/>
-          <w:lang w:val="en-PH"/>
-        </w:rPr>
-        <w:t>"For a weekday journey, consider travelling between 10:00 and 11:00 AM, when historical traffic volumes are typically lower."</w:t>
+        <w:drawing>
+          <wp:inline distT="0" distB="0" distL="0" distR="0" wp14:anchorId="313917A0" wp14:editId="726C2F63">
+            <wp:extent cx="5731510" cy="1388745"/>
+            <wp:effectExtent l="0" t="0" r="2540" b="1905"/>
+            <wp:docPr id="399587371" name="Picture 1"/>
+            <wp:cNvGraphicFramePr>
+              <a:graphicFrameLocks xmlns:a="http://schemas.openxmlformats.org/drawingml/2006/main" noChangeAspect="1"/>
+            </wp:cNvGraphicFramePr>
+            <a:graphic xmlns:a="http://schemas.openxmlformats.org/drawingml/2006/main">
+              <a:graphicData uri="http://schemas.openxmlformats.org/drawingml/2006/picture">
+                <pic:pic xmlns:pic="http://schemas.openxmlformats.org/drawingml/2006/picture">
+                  <pic:nvPicPr>
+                    <pic:cNvPr id="399587371" name=""/>
+                    <pic:cNvPicPr/>
+                  </pic:nvPicPr>
+                  <pic:blipFill>
+                    <a:blip r:embed="rId9"/>
+                    <a:stretch>
+                      <a:fillRect/>
+                    </a:stretch>
+                  </pic:blipFill>
+                  <pic:spPr>
+                    <a:xfrm>
+                      <a:off x="0" y="0"/>
+                      <a:ext cx="5731510" cy="1388745"/>
+                    </a:xfrm>
+                    <a:prstGeom prst="rect">
+                      <a:avLst/>
+                    </a:prstGeom>
+                  </pic:spPr>
+                </pic:pic>
+              </a:graphicData>
+            </a:graphic>
+          </wp:inline>
+        </w:drawing>
       </w:r>
     </w:p>
     <w:p>
@@ -4799,6 +4613,16 @@
       <w:pPr>
         <w:rPr>
           <w:rFonts w:ascii="Times New Roman" w:hAnsi="Times New Roman" w:cs="Times New Roman"/>
+          <w:sz w:val="22"/>
+          <w:szCs w:val="22"/>
+          <w:lang w:val="en-SG"/>
+        </w:rPr>
+      </w:pPr>
+    </w:p>
+    <w:p>
+      <w:pPr>
+        <w:rPr>
+          <w:rFonts w:ascii="Times New Roman" w:hAnsi="Times New Roman" w:cs="Times New Roman"/>
           <w:b/>
           <w:bCs/>
           <w:sz w:val="22"/>
@@ -4822,16 +4646,30 @@
     </w:p>
     <w:p>
       <w:pPr>
-        <w:pStyle w:val="ListParagraph"/>
-        <w:numPr>
-          <w:ilvl w:val="0"/>
-          <w:numId w:val="20"/>
-        </w:numPr>
-        <w:rPr>
-          <w:rFonts w:ascii="Times New Roman" w:hAnsi="Times New Roman" w:cs="Times New Roman"/>
-          <w:sz w:val="22"/>
-          <w:szCs w:val="22"/>
-          <w:lang w:val="en-PH"/>
+        <w:rPr>
+          <w:rFonts w:ascii="Times New Roman" w:hAnsi="Times New Roman" w:cs="Times New Roman"/>
+          <w:sz w:val="22"/>
+          <w:szCs w:val="22"/>
+          <w:lang w:val="en-SG"/>
+        </w:rPr>
+      </w:pPr>
+      <w:r>
+        <w:rPr>
+          <w:rFonts w:ascii="Times New Roman" w:hAnsi="Times New Roman" w:cs="Times New Roman"/>
+          <w:sz w:val="22"/>
+          <w:szCs w:val="22"/>
+          <w:lang w:val="en-SG"/>
+        </w:rPr>
+        <w:t>Several data-related limitations and potential sources of bias must be considered when interpreting the model's predictions and assessing its suitability for real-world traffic applications.</w:t>
+      </w:r>
+    </w:p>
+    <w:p>
+      <w:pPr>
+        <w:rPr>
+          <w:rFonts w:ascii="Times New Roman" w:hAnsi="Times New Roman" w:cs="Times New Roman"/>
+          <w:sz w:val="22"/>
+          <w:szCs w:val="22"/>
+          <w:lang w:val="en-SG"/>
         </w:rPr>
       </w:pPr>
       <w:r>
@@ -4841,91 +4679,211 @@
           <w:bCs/>
           <w:sz w:val="22"/>
           <w:szCs w:val="22"/>
-          <w:lang w:val="en-PH"/>
-        </w:rPr>
-        <w:t>Bias and fairness:</w:t>
-      </w:r>
-      <w:r>
-        <w:rPr>
-          <w:rFonts w:ascii="Times New Roman" w:hAnsi="Times New Roman" w:cs="Times New Roman"/>
-          <w:sz w:val="22"/>
-          <w:szCs w:val="22"/>
-          <w:lang w:val="en-PH"/>
-        </w:rPr>
-        <w:t xml:space="preserve"> Write a bias and fairness report covering, at a minimum: </w:t>
+          <w:lang w:val="en-SG"/>
+        </w:rPr>
+        <w:t>Sampling and coverage limitations.</w:t>
+      </w:r>
+      <w:r>
+        <w:rPr>
+          <w:rFonts w:ascii="Times New Roman" w:hAnsi="Times New Roman" w:cs="Times New Roman"/>
+          <w:sz w:val="22"/>
+          <w:szCs w:val="22"/>
+          <w:lang w:val="en-SG"/>
+        </w:rPr>
+        <w:t xml:space="preserve"> The dataset covers only one stretch of road, meaning that the findings may not generalise to other roads with different layouts, traffic patterns, or surrounding infrastructure. Traffic conditions on the selected road are also influenced by neighbouring roads, intersections, and the wider road network, which may not be fully captured by the available features. Furthermore, a considerable number of data points are missing for 2014 and 2015, potentially reducing the reliability of predictions </w:t>
+      </w:r>
+      <w:proofErr w:type="gramStart"/>
+      <w:r>
+        <w:rPr>
+          <w:rFonts w:ascii="Times New Roman" w:hAnsi="Times New Roman" w:cs="Times New Roman"/>
+          <w:sz w:val="22"/>
+          <w:szCs w:val="22"/>
+          <w:lang w:val="en-SG"/>
+        </w:rPr>
+        <w:t>and also</w:t>
+      </w:r>
+      <w:proofErr w:type="gramEnd"/>
+      <w:r>
+        <w:rPr>
+          <w:rFonts w:ascii="Times New Roman" w:hAnsi="Times New Roman" w:cs="Times New Roman"/>
+          <w:sz w:val="22"/>
+          <w:szCs w:val="22"/>
+          <w:lang w:val="en-SG"/>
+        </w:rPr>
+        <w:t xml:space="preserve"> lacking</w:t>
+      </w:r>
+      <w:r>
+        <w:rPr>
+          <w:rFonts w:ascii="Times New Roman" w:hAnsi="Times New Roman" w:cs="Times New Roman"/>
+          <w:sz w:val="22"/>
+          <w:szCs w:val="22"/>
+          <w:lang w:val="en-SG"/>
+        </w:rPr>
+        <w:t xml:space="preserve"> representative coverage across all days of the year, including holidays</w:t>
+      </w:r>
+      <w:r>
+        <w:rPr>
+          <w:rFonts w:ascii="Times New Roman" w:hAnsi="Times New Roman" w:cs="Times New Roman"/>
+          <w:sz w:val="22"/>
+          <w:szCs w:val="22"/>
+          <w:lang w:val="en-SG"/>
+        </w:rPr>
+        <w:t xml:space="preserve"> </w:t>
+      </w:r>
+      <w:r>
+        <w:rPr>
+          <w:rFonts w:ascii="Times New Roman" w:hAnsi="Times New Roman" w:cs="Times New Roman"/>
+          <w:sz w:val="22"/>
+          <w:szCs w:val="22"/>
+          <w:lang w:val="en-SG"/>
+        </w:rPr>
+        <w:t>and seasonal traffic variations. Consequently, the model may perform less reliably under conditions that are poorly represented in the training data.</w:t>
       </w:r>
     </w:p>
     <w:p>
       <w:pPr>
-        <w:pStyle w:val="ListParagraph"/>
-        <w:numPr>
-          <w:ilvl w:val="0"/>
-          <w:numId w:val="21"/>
-        </w:numPr>
-        <w:rPr>
-          <w:rFonts w:ascii="Times New Roman" w:hAnsi="Times New Roman" w:cs="Times New Roman"/>
-          <w:sz w:val="22"/>
-          <w:szCs w:val="22"/>
-          <w:lang w:val="en-PH"/>
-        </w:rPr>
-      </w:pPr>
-      <w:r>
-        <w:rPr>
-          <w:rFonts w:ascii="Times New Roman" w:hAnsi="Times New Roman" w:cs="Times New Roman"/>
-          <w:sz w:val="22"/>
-          <w:szCs w:val="22"/>
-          <w:lang w:val="en-PH"/>
-        </w:rPr>
-        <w:t xml:space="preserve">Any known sampling or coverage limitations in your data. </w:t>
+        <w:rPr>
+          <w:rFonts w:ascii="Times New Roman" w:hAnsi="Times New Roman" w:cs="Times New Roman"/>
+          <w:sz w:val="22"/>
+          <w:szCs w:val="22"/>
+          <w:lang w:val="en-SG"/>
+        </w:rPr>
+      </w:pPr>
+      <w:r>
+        <w:rPr>
+          <w:rFonts w:ascii="Times New Roman" w:hAnsi="Times New Roman" w:cs="Times New Roman"/>
+          <w:b/>
+          <w:bCs/>
+          <w:sz w:val="22"/>
+          <w:szCs w:val="22"/>
+          <w:lang w:val="en-SG"/>
+        </w:rPr>
+        <w:t>Proxy labels and associated risks.</w:t>
+      </w:r>
+      <w:r>
+        <w:rPr>
+          <w:rFonts w:ascii="Times New Roman" w:hAnsi="Times New Roman" w:cs="Times New Roman"/>
+          <w:sz w:val="22"/>
+          <w:szCs w:val="22"/>
+          <w:lang w:val="en-SG"/>
+        </w:rPr>
+        <w:t xml:space="preserve"> Proxy labels were used to represent accident risk and congestion categories. Accident risk was approximated using existing traffic and weather variables rather than directly observed accident records. This introduces uncertainty because the proxy may not accurately reflect actual accident occurrence or severity. Furthermore, if the same variables used to construct the proxy are subsequently used as model inputs, the model may achieve high accuracy by reproducing the proxy's underlying rules rather than learning meaningful relationships with real-world accident risk. Its performance may therefore overstate its ability to predict actual accident</w:t>
+      </w:r>
+      <w:r>
+        <w:rPr>
+          <w:rFonts w:ascii="Times New Roman" w:hAnsi="Times New Roman" w:cs="Times New Roman"/>
+          <w:sz w:val="22"/>
+          <w:szCs w:val="22"/>
+          <w:lang w:val="en-SG"/>
+        </w:rPr>
+        <w:t xml:space="preserve"> risks</w:t>
+      </w:r>
+      <w:r>
+        <w:rPr>
+          <w:rFonts w:ascii="Times New Roman" w:hAnsi="Times New Roman" w:cs="Times New Roman"/>
+          <w:sz w:val="22"/>
+          <w:szCs w:val="22"/>
+          <w:lang w:val="en-SG"/>
+        </w:rPr>
+        <w:t>.</w:t>
       </w:r>
     </w:p>
     <w:p>
       <w:pPr>
-        <w:pStyle w:val="ListParagraph"/>
-        <w:numPr>
-          <w:ilvl w:val="0"/>
-          <w:numId w:val="21"/>
-        </w:numPr>
-        <w:rPr>
-          <w:rFonts w:ascii="Times New Roman" w:hAnsi="Times New Roman" w:cs="Times New Roman"/>
-          <w:sz w:val="22"/>
-          <w:szCs w:val="22"/>
-          <w:lang w:val="en-PH"/>
-        </w:rPr>
-      </w:pPr>
-      <w:r>
-        <w:rPr>
-          <w:rFonts w:ascii="Times New Roman" w:hAnsi="Times New Roman" w:cs="Times New Roman"/>
-          <w:sz w:val="22"/>
-          <w:szCs w:val="22"/>
-          <w:lang w:val="en-PH"/>
-        </w:rPr>
-        <w:t xml:space="preserve">Any proxy labels you used and the risks associated with them. </w:t>
+        <w:rPr>
+          <w:rFonts w:ascii="Times New Roman" w:hAnsi="Times New Roman" w:cs="Times New Roman"/>
+          <w:sz w:val="22"/>
+          <w:szCs w:val="22"/>
+          <w:lang w:val="en-SG"/>
+        </w:rPr>
+      </w:pPr>
+      <w:r>
+        <w:rPr>
+          <w:rFonts w:ascii="Times New Roman" w:hAnsi="Times New Roman" w:cs="Times New Roman"/>
+          <w:sz w:val="22"/>
+          <w:szCs w:val="22"/>
+          <w:lang w:val="en-SG"/>
+        </w:rPr>
+        <w:t xml:space="preserve">Similarly, congestion categories were derived from traffic volume. Traffic volume was deliberately excluded from the input features when predicting congestion categories to avoid directly supplying the variable used to construct the target label. </w:t>
+      </w:r>
+      <w:r>
+        <w:rPr>
+          <w:rFonts w:ascii="Times New Roman" w:hAnsi="Times New Roman" w:cs="Times New Roman"/>
+          <w:sz w:val="22"/>
+          <w:szCs w:val="22"/>
+          <w:lang w:val="en-SG"/>
+        </w:rPr>
+        <w:t xml:space="preserve">However, traffic volume not may </w:t>
+      </w:r>
+      <w:proofErr w:type="gramStart"/>
+      <w:r>
+        <w:rPr>
+          <w:rFonts w:ascii="Times New Roman" w:hAnsi="Times New Roman" w:cs="Times New Roman"/>
+          <w:sz w:val="22"/>
+          <w:szCs w:val="22"/>
+          <w:lang w:val="en-SG"/>
+        </w:rPr>
+        <w:t>actually directly</w:t>
+      </w:r>
+      <w:proofErr w:type="gramEnd"/>
+      <w:r>
+        <w:rPr>
+          <w:rFonts w:ascii="Times New Roman" w:hAnsi="Times New Roman" w:cs="Times New Roman"/>
+          <w:sz w:val="22"/>
+          <w:szCs w:val="22"/>
+          <w:lang w:val="en-SG"/>
+        </w:rPr>
+        <w:t xml:space="preserve"> correlate to congestion conditions on the </w:t>
+      </w:r>
+      <w:proofErr w:type="gramStart"/>
+      <w:r>
+        <w:rPr>
+          <w:rFonts w:ascii="Times New Roman" w:hAnsi="Times New Roman" w:cs="Times New Roman"/>
+          <w:sz w:val="22"/>
+          <w:szCs w:val="22"/>
+          <w:lang w:val="en-SG"/>
+        </w:rPr>
+        <w:t>road in reality</w:t>
+      </w:r>
+      <w:proofErr w:type="gramEnd"/>
+      <w:r>
+        <w:rPr>
+          <w:rFonts w:ascii="Times New Roman" w:hAnsi="Times New Roman" w:cs="Times New Roman"/>
+          <w:sz w:val="22"/>
+          <w:szCs w:val="22"/>
+          <w:lang w:val="en-SG"/>
+        </w:rPr>
+        <w:t xml:space="preserve">. </w:t>
       </w:r>
     </w:p>
     <w:p>
       <w:pPr>
-        <w:pStyle w:val="ListParagraph"/>
-        <w:numPr>
-          <w:ilvl w:val="0"/>
-          <w:numId w:val="21"/>
-        </w:numPr>
-        <w:rPr>
-          <w:rFonts w:ascii="Times New Roman" w:hAnsi="Times New Roman" w:cs="Times New Roman"/>
-          <w:sz w:val="22"/>
-          <w:szCs w:val="22"/>
-          <w:lang w:val="en-PH"/>
-        </w:rPr>
-      </w:pPr>
-      <w:r>
-        <w:rPr>
-          <w:rFonts w:ascii="Times New Roman" w:hAnsi="Times New Roman" w:cs="Times New Roman"/>
-          <w:sz w:val="22"/>
-          <w:szCs w:val="22"/>
-          <w:lang w:val="en-PH"/>
-        </w:rPr>
-        <w:lastRenderedPageBreak/>
-        <w:t xml:space="preserve">How errors might be distributed unevenly across different conditions or time periods. </w:t>
+        <w:rPr>
+          <w:rFonts w:ascii="Times New Roman" w:hAnsi="Times New Roman" w:cs="Times New Roman"/>
+          <w:sz w:val="22"/>
+          <w:szCs w:val="22"/>
+          <w:lang w:val="en-SG"/>
+        </w:rPr>
+      </w:pPr>
+      <w:r>
+        <w:rPr>
+          <w:rFonts w:ascii="Times New Roman" w:hAnsi="Times New Roman" w:cs="Times New Roman"/>
+          <w:b/>
+          <w:bCs/>
+          <w:sz w:val="22"/>
+          <w:szCs w:val="22"/>
+          <w:lang w:val="en-SG"/>
+        </w:rPr>
+        <w:t>Uneven error distribution and weather imbalance.</w:t>
+      </w:r>
+      <w:r>
+        <w:rPr>
+          <w:rFonts w:ascii="Times New Roman" w:hAnsi="Times New Roman" w:cs="Times New Roman"/>
+          <w:sz w:val="22"/>
+          <w:szCs w:val="22"/>
+          <w:lang w:val="en-SG"/>
+        </w:rPr>
+        <w:t xml:space="preserve"> The dataset is relatively imbalanced across weather conditions. Clear and cloudy conditions occur much more frequently than less common conditions such as fog and smoke. As a result, the model may learn common conditions more effectively while producing less reliable predictions for rare weather events. Overall accuracy or MAE may conceal these differences in performance. Similarly, missing observations in 2014 and 2015 may result in uneven prediction errors across time periods, particularly if traffic patterns have changed over the years.</w:t>
       </w:r>
     </w:p>
     <w:p>
@@ -4934,17 +4892,17 @@
           <w:rFonts w:ascii="Times New Roman" w:hAnsi="Times New Roman" w:cs="Times New Roman"/>
           <w:sz w:val="22"/>
           <w:szCs w:val="22"/>
-          <w:lang w:val="en-PH"/>
-        </w:rPr>
-      </w:pPr>
-      <w:r>
-        <w:rPr>
-          <w:rFonts w:ascii="Times New Roman" w:hAnsi="Times New Roman" w:cs="Times New Roman"/>
-          <w:sz w:val="22"/>
-          <w:szCs w:val="22"/>
-          <w:lang w:val="en-PH"/>
-        </w:rPr>
-        <w:t xml:space="preserve">Sampling limitation is that this is only for one stretch of road. Traffic conditions are also affected by the surrounding roads. </w:t>
+          <w:lang w:val="en-SG"/>
+        </w:rPr>
+      </w:pPr>
+      <w:r>
+        <w:rPr>
+          <w:rFonts w:ascii="Times New Roman" w:hAnsi="Times New Roman" w:cs="Times New Roman"/>
+          <w:sz w:val="22"/>
+          <w:szCs w:val="22"/>
+          <w:lang w:val="en-SG"/>
+        </w:rPr>
+        <w:t>Overall, these limitations mean that the model should be treated as a decision-support tool rather than an unquestionable source of truth. Further validation using more geographically diverse data, better temporal coverage, and directly observed accident records would improve the reliability and fairness of its predictions.</w:t>
       </w:r>
     </w:p>
     <w:p>
@@ -4953,9 +4911,29 @@
           <w:rFonts w:ascii="Times New Roman" w:hAnsi="Times New Roman" w:cs="Times New Roman"/>
           <w:sz w:val="22"/>
           <w:szCs w:val="22"/>
-          <w:lang w:val="en-PH"/>
-        </w:rPr>
-      </w:pPr>
+          <w:lang w:val="en-SG"/>
+        </w:rPr>
+      </w:pPr>
+      <w:r>
+        <w:rPr>
+          <w:rFonts w:ascii="Times New Roman" w:hAnsi="Times New Roman" w:cs="Times New Roman"/>
+          <w:b/>
+          <w:bCs/>
+          <w:sz w:val="22"/>
+          <w:szCs w:val="22"/>
+          <w:lang w:val="en-SG"/>
+        </w:rPr>
+        <w:t>Governance and human oversight.</w:t>
+      </w:r>
+      <w:r>
+        <w:rPr>
+          <w:rFonts w:ascii="Times New Roman" w:hAnsi="Times New Roman" w:cs="Times New Roman"/>
+          <w:sz w:val="22"/>
+          <w:szCs w:val="22"/>
+          <w:lang w:val="en-SG"/>
+        </w:rPr>
+        <w:t xml:space="preserve"> Mobility AI requires careful governance because its decisions and recommendations can affect not only its direct users but also other road users, pedestrians, cyclists, and surrounding communities. Before a model is used for real-world decision-making, it should undergo rigorous testing to assess predictive accuracy, reliability, robustness, and potential bias under different traffic and weather conditions. Compliance with applicable laws and regulations, including traffic and data-protection requirements, should be treated as a minimum standard.</w:t>
+      </w:r>
     </w:p>
     <w:p>
       <w:pPr>
@@ -4963,35 +4941,27 @@
           <w:rFonts w:ascii="Times New Roman" w:hAnsi="Times New Roman" w:cs="Times New Roman"/>
           <w:sz w:val="22"/>
           <w:szCs w:val="22"/>
-          <w:lang w:val="en-PH"/>
-        </w:rPr>
-      </w:pPr>
-      <w:r>
-        <w:rPr>
-          <w:rFonts w:ascii="Times New Roman" w:hAnsi="Times New Roman" w:cs="Times New Roman"/>
-          <w:sz w:val="22"/>
-          <w:szCs w:val="22"/>
-          <w:lang w:val="en-PH"/>
-        </w:rPr>
-        <w:t>A proxy was used for accident risk, derived from existing</w:t>
-      </w:r>
-      <w:r>
-        <w:rPr>
-          <w:rFonts w:ascii="Times New Roman" w:hAnsi="Times New Roman" w:cs="Times New Roman"/>
-          <w:sz w:val="22"/>
-          <w:szCs w:val="22"/>
-          <w:lang w:val="en-PH"/>
-        </w:rPr>
-        <w:t xml:space="preserve"> traffic and weather</w:t>
-      </w:r>
-      <w:r>
-        <w:rPr>
-          <w:rFonts w:ascii="Times New Roman" w:hAnsi="Times New Roman" w:cs="Times New Roman"/>
-          <w:sz w:val="22"/>
-          <w:szCs w:val="22"/>
-          <w:lang w:val="en-PH"/>
-        </w:rPr>
-        <w:t xml:space="preserve"> variables – using existing variables to predict this proxy label is then a bit less reliable and also much easier for the ML models to achieve high levels of accuracy. </w:t>
+          <w:lang w:val="en-SG"/>
+        </w:rPr>
+      </w:pPr>
+      <w:r>
+        <w:rPr>
+          <w:rFonts w:ascii="Times New Roman" w:hAnsi="Times New Roman" w:cs="Times New Roman"/>
+          <w:sz w:val="22"/>
+          <w:szCs w:val="22"/>
+          <w:lang w:val="en-SG"/>
+        </w:rPr>
+        <w:t xml:space="preserve">Human oversight is also essential, particularly for applications involving road safety, accident risk, or traffic management. A qualified human should be able to review consequential recommendations, </w:t>
+      </w:r>
+      <w:r>
+        <w:rPr>
+          <w:rFonts w:ascii="Times New Roman" w:hAnsi="Times New Roman" w:cs="Times New Roman"/>
+          <w:sz w:val="22"/>
+          <w:szCs w:val="22"/>
+          <w:lang w:val="en-SG"/>
+        </w:rPr>
+        <w:lastRenderedPageBreak/>
+        <w:t>challenge questionable predictions, and intervene when necessary. Clear accountability must be established so that responsibility for decisions is not delegated entirely to an automated system. Models should also be monitored after deployment to detect performance deterioration, changes in traffic patterns, and unexpected errors. Where significant risks are identified, there should be procedures for correcting, restricting, or withdrawing the system.</w:t>
       </w:r>
     </w:p>
     <w:p>
@@ -5000,17 +4970,28 @@
           <w:rFonts w:ascii="Times New Roman" w:hAnsi="Times New Roman" w:cs="Times New Roman"/>
           <w:sz w:val="22"/>
           <w:szCs w:val="22"/>
-          <w:lang w:val="en-PH"/>
-        </w:rPr>
-      </w:pPr>
-      <w:r>
-        <w:rPr>
-          <w:rFonts w:ascii="Times New Roman" w:hAnsi="Times New Roman" w:cs="Times New Roman"/>
-          <w:sz w:val="22"/>
-          <w:szCs w:val="22"/>
-          <w:lang w:val="en-PH"/>
-        </w:rPr>
-        <w:t xml:space="preserve">Proxy label was used for congestion category, derived from traffic volume. When trying to predict for congestion category, I have always omitted traffic volume from the dataset. </w:t>
+          <w:lang w:val="en-SG"/>
+        </w:rPr>
+      </w:pPr>
+      <w:r>
+        <w:rPr>
+          <w:rFonts w:ascii="Times New Roman" w:hAnsi="Times New Roman" w:cs="Times New Roman"/>
+          <w:b/>
+          <w:bCs/>
+          <w:sz w:val="22"/>
+          <w:szCs w:val="22"/>
+          <w:lang w:val="en-SG"/>
+        </w:rPr>
+        <w:t>Environmental and computational sustainability.</w:t>
+      </w:r>
+      <w:r>
+        <w:rPr>
+          <w:rFonts w:ascii="Times New Roman" w:hAnsi="Times New Roman" w:cs="Times New Roman"/>
+          <w:sz w:val="22"/>
+          <w:szCs w:val="22"/>
+          <w:lang w:val="en-SG"/>
+        </w:rPr>
+        <w:t xml:space="preserve"> Developing and deploying AI models involves trade-offs between predictive performance and computational resource consumption. Training more complex models or increasing the number of epochs can require additional electricity, computing capacity, and associated infrastructure resources. Data centres also consume water for cooling, while electricity generation may contribute to greenhouse gas emissions depending on the energy source.</w:t>
       </w:r>
     </w:p>
     <w:p>
@@ -5019,9 +5000,18 @@
           <w:rFonts w:ascii="Times New Roman" w:hAnsi="Times New Roman" w:cs="Times New Roman"/>
           <w:sz w:val="22"/>
           <w:szCs w:val="22"/>
-          <w:lang w:val="en-PH"/>
-        </w:rPr>
-      </w:pPr>
+          <w:lang w:val="en-SG"/>
+        </w:rPr>
+      </w:pPr>
+      <w:r>
+        <w:rPr>
+          <w:rFonts w:ascii="Times New Roman" w:hAnsi="Times New Roman" w:cs="Times New Roman"/>
+          <w:sz w:val="22"/>
+          <w:szCs w:val="22"/>
+          <w:lang w:val="en-SG"/>
+        </w:rPr>
+        <w:t>These considerations highlight the importance of balancing model accuracy against environmental cost. In this project, the ANN was evaluated using different epoch counts. Increasing training from 200 to 400 epochs produced only a modest improvement in MAE despite doubling the number of training epochs. Stopping at 200 epochs was therefore a practical choice to limit unnecessary computation while retaining reasonable predictive performance. Early stopping, efficient feature selection, and comparisons with simpler models could further reduce resource consumption without substantially compromising accuracy.</w:t>
+      </w:r>
     </w:p>
     <w:p>
       <w:pPr>
@@ -5029,214 +5019,38 @@
           <w:rFonts w:ascii="Times New Roman" w:hAnsi="Times New Roman" w:cs="Times New Roman"/>
           <w:sz w:val="22"/>
           <w:szCs w:val="22"/>
-          <w:lang w:val="en-PH"/>
-        </w:rPr>
-      </w:pPr>
-      <w:r>
-        <w:rPr>
-          <w:rFonts w:ascii="Times New Roman" w:hAnsi="Times New Roman" w:cs="Times New Roman"/>
-          <w:sz w:val="22"/>
-          <w:szCs w:val="22"/>
-          <w:lang w:val="en-PH"/>
-        </w:rPr>
-        <w:t>Known issues being that I know a good number of datapoints is missing for 2014 and 2015. Coverage may not be representative across the days of the year.</w:t>
-      </w:r>
-      <w:r>
-        <w:rPr>
-          <w:rFonts w:ascii="Times New Roman" w:hAnsi="Times New Roman" w:cs="Times New Roman"/>
-          <w:sz w:val="22"/>
-          <w:szCs w:val="22"/>
-          <w:lang w:val="en-PH"/>
-        </w:rPr>
-        <w:t xml:space="preserve"> </w:t>
-      </w:r>
-      <w:proofErr w:type="spellStart"/>
-      <w:r>
-        <w:rPr>
-          <w:rFonts w:ascii="Times New Roman" w:hAnsi="Times New Roman" w:cs="Times New Roman"/>
-          <w:sz w:val="22"/>
-          <w:szCs w:val="22"/>
-          <w:lang w:val="en-PH"/>
-        </w:rPr>
-        <w:t>Similiarly</w:t>
-      </w:r>
-      <w:proofErr w:type="spellEnd"/>
-      <w:r>
-        <w:rPr>
-          <w:rFonts w:ascii="Times New Roman" w:hAnsi="Times New Roman" w:cs="Times New Roman"/>
-          <w:sz w:val="22"/>
-          <w:szCs w:val="22"/>
-          <w:lang w:val="en-PH"/>
-        </w:rPr>
-        <w:t xml:space="preserve">, this is a relatively imbalanced dataset in terms of weather conditions. Some conditions like fog and smoke have significantly less occurrences than others like clear and cloudy. Perhaps </w:t>
-      </w:r>
-      <w:r>
-        <w:rPr>
-          <w:rFonts w:ascii="Times New Roman" w:hAnsi="Times New Roman" w:cs="Times New Roman"/>
-          <w:sz w:val="22"/>
-          <w:szCs w:val="22"/>
-          <w:lang w:val="en-PH"/>
-        </w:rPr>
-        <w:t xml:space="preserve">boosting is a good area to pursue next in order to improve accuracy. </w:t>
+          <w:lang w:val="en-SG"/>
+        </w:rPr>
+      </w:pPr>
+      <w:r>
+        <w:rPr>
+          <w:rFonts w:ascii="Times New Roman" w:hAnsi="Times New Roman" w:cs="Times New Roman"/>
+          <w:sz w:val="22"/>
+          <w:szCs w:val="22"/>
+          <w:lang w:val="en-SG"/>
+        </w:rPr>
+        <w:t>Ultimately, sustainable mobility AI should aim to deliver measurable benefits while minimising unnecessary computational expenditure and environmental impact. The most appropriate model is not necessarily the most complex or computationally intensive one, but the model that achieves an acceptable level of accuracy, fairness, reliability, and transparency with proportionate use of resources.</w:t>
       </w:r>
     </w:p>
     <w:p>
       <w:pPr>
-        <w:pStyle w:val="ListParagraph"/>
-        <w:numPr>
-          <w:ilvl w:val="0"/>
-          <w:numId w:val="20"/>
-        </w:numPr>
-        <w:rPr>
-          <w:rFonts w:ascii="Times New Roman" w:hAnsi="Times New Roman" w:cs="Times New Roman"/>
-          <w:sz w:val="22"/>
-          <w:szCs w:val="22"/>
-          <w:lang w:val="en-PH"/>
-        </w:rPr>
-      </w:pPr>
-      <w:r>
-        <w:rPr>
-          <w:rFonts w:ascii="Times New Roman" w:hAnsi="Times New Roman" w:cs="Times New Roman"/>
-          <w:b/>
-          <w:bCs/>
-          <w:sz w:val="22"/>
-          <w:szCs w:val="22"/>
-          <w:lang w:val="en-PH"/>
-        </w:rPr>
-        <w:t>Governance and sustainability:</w:t>
-      </w:r>
-      <w:r>
-        <w:rPr>
-          <w:rFonts w:ascii="Times New Roman" w:hAnsi="Times New Roman" w:cs="Times New Roman"/>
-          <w:sz w:val="22"/>
-          <w:szCs w:val="22"/>
-          <w:lang w:val="en-PH"/>
-        </w:rPr>
-        <w:t xml:space="preserve"> Include a short discussion of governance and sustainability in mobility AI. Consider: </w:t>
-      </w:r>
+        <w:rPr>
+          <w:rFonts w:ascii="Times New Roman" w:hAnsi="Times New Roman" w:cs="Times New Roman"/>
+          <w:sz w:val="22"/>
+          <w:szCs w:val="22"/>
+          <w:lang w:val="en-SG"/>
+        </w:rPr>
+      </w:pPr>
     </w:p>
     <w:p>
       <w:pPr>
-        <w:pStyle w:val="ListParagraph"/>
-        <w:numPr>
-          <w:ilvl w:val="0"/>
-          <w:numId w:val="22"/>
-        </w:numPr>
-        <w:rPr>
-          <w:rFonts w:ascii="Times New Roman" w:hAnsi="Times New Roman" w:cs="Times New Roman"/>
-          <w:sz w:val="22"/>
-          <w:szCs w:val="22"/>
-          <w:lang w:val="en-PH"/>
-        </w:rPr>
-      </w:pPr>
-      <w:r>
-        <w:rPr>
-          <w:rFonts w:ascii="Times New Roman" w:hAnsi="Times New Roman" w:cs="Times New Roman"/>
-          <w:sz w:val="22"/>
-          <w:szCs w:val="22"/>
-          <w:lang w:val="en-PH"/>
-        </w:rPr>
-        <w:t xml:space="preserve">What oversight should be in place before a model is trusted for real-world decision-making. </w:t>
-      </w:r>
-    </w:p>
-    <w:p>
-      <w:pPr>
-        <w:pStyle w:val="ListParagraph"/>
-        <w:numPr>
-          <w:ilvl w:val="0"/>
-          <w:numId w:val="22"/>
-        </w:numPr>
-        <w:rPr>
-          <w:rFonts w:ascii="Times New Roman" w:hAnsi="Times New Roman" w:cs="Times New Roman"/>
-          <w:sz w:val="22"/>
-          <w:szCs w:val="22"/>
-          <w:lang w:val="en-PH"/>
-        </w:rPr>
-      </w:pPr>
-      <w:r>
-        <w:rPr>
-          <w:rFonts w:ascii="Times New Roman" w:hAnsi="Times New Roman" w:cs="Times New Roman"/>
-          <w:sz w:val="22"/>
-          <w:szCs w:val="22"/>
-          <w:lang w:val="en-PH"/>
-        </w:rPr>
-        <w:t>The environmental or resource trade-offs associated with your modelling choices.</w:t>
-      </w:r>
-    </w:p>
-    <w:p>
-      <w:pPr>
-        <w:rPr>
-          <w:rFonts w:ascii="Times New Roman" w:hAnsi="Times New Roman" w:cs="Times New Roman"/>
-          <w:sz w:val="22"/>
-          <w:szCs w:val="22"/>
-          <w:lang w:val="en-SG"/>
-        </w:rPr>
-      </w:pPr>
-      <w:r>
-        <w:rPr>
-          <w:rFonts w:ascii="Times New Roman" w:hAnsi="Times New Roman" w:cs="Times New Roman"/>
-          <w:sz w:val="22"/>
-          <w:szCs w:val="22"/>
-          <w:lang w:val="en-SG"/>
-        </w:rPr>
-        <w:t xml:space="preserve">Mobility is a sensitive area as it directly affects many humans, including those who did not use to utilise the AI solution whatever it may be. </w:t>
-      </w:r>
-      <w:r>
-        <w:rPr>
-          <w:rFonts w:ascii="Times New Roman" w:hAnsi="Times New Roman" w:cs="Times New Roman"/>
-          <w:sz w:val="22"/>
-          <w:szCs w:val="22"/>
-          <w:lang w:val="en-SG"/>
-        </w:rPr>
-        <w:t xml:space="preserve">Oversight should ensure that </w:t>
-      </w:r>
-      <w:r>
-        <w:rPr>
-          <w:rFonts w:ascii="Times New Roman" w:hAnsi="Times New Roman" w:cs="Times New Roman"/>
-          <w:sz w:val="22"/>
-          <w:szCs w:val="22"/>
-          <w:lang w:val="en-SG"/>
-        </w:rPr>
-        <w:t xml:space="preserve">local laws and regulations (such as traffic laws) are followed strictly as a bare minimum. </w:t>
-      </w:r>
-    </w:p>
-    <w:p>
-      <w:pPr>
-        <w:rPr>
-          <w:rFonts w:ascii="Times New Roman" w:hAnsi="Times New Roman" w:cs="Times New Roman"/>
-          <w:sz w:val="22"/>
-          <w:szCs w:val="22"/>
-          <w:lang w:val="en-SG"/>
-        </w:rPr>
-      </w:pPr>
-      <w:r>
-        <w:rPr>
-          <w:rFonts w:ascii="Times New Roman" w:hAnsi="Times New Roman" w:cs="Times New Roman"/>
-          <w:sz w:val="22"/>
-          <w:szCs w:val="22"/>
-          <w:lang w:val="en-SG"/>
-        </w:rPr>
-        <w:t xml:space="preserve">It is also key to ensure that there is a human layer before implementation, to ensure that accountability lies with a human review. </w:t>
-      </w:r>
-    </w:p>
-    <w:p>
-      <w:pPr>
-        <w:rPr>
-          <w:rFonts w:ascii="Times New Roman" w:hAnsi="Times New Roman" w:cs="Times New Roman"/>
-          <w:sz w:val="22"/>
-          <w:szCs w:val="22"/>
-          <w:lang w:val="en-SG"/>
-        </w:rPr>
-      </w:pPr>
-      <w:r>
-        <w:rPr>
-          <w:rFonts w:ascii="Times New Roman" w:hAnsi="Times New Roman" w:cs="Times New Roman"/>
-          <w:sz w:val="22"/>
-          <w:szCs w:val="22"/>
-          <w:lang w:val="en-SG"/>
-        </w:rPr>
-        <w:t xml:space="preserve">AI is known to consume a lot of environment resources at the moment, competing with human communities for limited essential resources such as energy and water. It is important to balance AI resource usage and accuracy in order to ensure prudent use of resources by AI. </w:t>
-      </w:r>
+        <w:rPr>
+          <w:rFonts w:ascii="Times New Roman" w:hAnsi="Times New Roman" w:cs="Times New Roman"/>
+          <w:sz w:val="22"/>
+          <w:szCs w:val="22"/>
+          <w:lang w:val="en-SG"/>
+        </w:rPr>
+      </w:pPr>
     </w:p>
     <w:sectPr>
       <w:pgSz w:w="11906" w:h="16838"/>

</xml_diff>

<commit_message>
Finalise part3 written report
</commit_message>
<xml_diff>
--- a/part3_machine_learning/3_Machine Learning Report.docx
+++ b/part3_machine_learning/3_Machine Learning Report.docx
@@ -4266,7 +4266,7 @@
           <w:bCs/>
           <w:sz w:val="20"/>
           <w:szCs w:val="20"/>
-          <w:lang w:val="en-PH"/>
+          <w:lang w:val="en-SG"/>
         </w:rPr>
       </w:pPr>
       <w:r>
@@ -4276,12 +4276,225 @@
           <w:bCs/>
           <w:sz w:val="20"/>
           <w:szCs w:val="20"/>
+          <w:lang w:val="en-SG"/>
+        </w:rPr>
+        <w:t>Model Quantisation and Results</w:t>
+      </w:r>
+    </w:p>
+    <w:p>
+      <w:pPr>
+        <w:rPr>
+          <w:rFonts w:ascii="Arial" w:hAnsi="Arial" w:cs="Arial"/>
+          <w:sz w:val="20"/>
+          <w:szCs w:val="20"/>
+          <w:lang w:val="en-SG"/>
+        </w:rPr>
+      </w:pPr>
+      <w:r>
+        <w:rPr>
+          <w:rFonts w:ascii="Arial" w:hAnsi="Arial" w:cs="Arial"/>
+          <w:sz w:val="20"/>
+          <w:szCs w:val="20"/>
+          <w:lang w:val="en-SG"/>
+        </w:rPr>
+        <w:t xml:space="preserve">Post-training dynamic-range quantisation was applied to the trained artificial neural network (ANN) using TensorFlow Lite to reduce model size while maintaining predictive performance. The model size decreased from 35.79 KB to 3.14 KB, representing a 91.22% reduction. </w:t>
+      </w:r>
+    </w:p>
+    <w:p>
+      <w:pPr>
+        <w:jc w:val="center"/>
+        <w:rPr>
+          <w:rFonts w:ascii="Arial" w:hAnsi="Arial" w:cs="Arial"/>
+          <w:sz w:val="20"/>
+          <w:szCs w:val="20"/>
+          <w:lang w:val="en-SG"/>
+        </w:rPr>
+      </w:pPr>
+      <w:r>
+        <w:rPr>
+          <w:rFonts w:ascii="Arial" w:hAnsi="Arial" w:cs="Arial"/>
+          <w:sz w:val="20"/>
+          <w:szCs w:val="20"/>
+          <w:lang w:val="en-SG"/>
+        </w:rPr>
+        <w:drawing>
+          <wp:inline distT="0" distB="0" distL="0" distR="0" wp14:anchorId="30A3D1ED" wp14:editId="17B94BC4">
+            <wp:extent cx="2143424" cy="628738"/>
+            <wp:effectExtent l="0" t="0" r="0" b="0"/>
+            <wp:docPr id="1424618076" name="Picture 1"/>
+            <wp:cNvGraphicFramePr>
+              <a:graphicFrameLocks xmlns:a="http://schemas.openxmlformats.org/drawingml/2006/main" noChangeAspect="1"/>
+            </wp:cNvGraphicFramePr>
+            <a:graphic xmlns:a="http://schemas.openxmlformats.org/drawingml/2006/main">
+              <a:graphicData uri="http://schemas.openxmlformats.org/drawingml/2006/picture">
+                <pic:pic xmlns:pic="http://schemas.openxmlformats.org/drawingml/2006/picture">
+                  <pic:nvPicPr>
+                    <pic:cNvPr id="1424618076" name=""/>
+                    <pic:cNvPicPr/>
+                  </pic:nvPicPr>
+                  <pic:blipFill>
+                    <a:blip r:embed="rId9"/>
+                    <a:stretch>
+                      <a:fillRect/>
+                    </a:stretch>
+                  </pic:blipFill>
+                  <pic:spPr>
+                    <a:xfrm>
+                      <a:off x="0" y="0"/>
+                      <a:ext cx="2143424" cy="628738"/>
+                    </a:xfrm>
+                    <a:prstGeom prst="rect">
+                      <a:avLst/>
+                    </a:prstGeom>
+                  </pic:spPr>
+                </pic:pic>
+              </a:graphicData>
+            </a:graphic>
+          </wp:inline>
+        </w:drawing>
+      </w:r>
+    </w:p>
+    <w:p>
+      <w:pPr>
+        <w:rPr>
+          <w:rFonts w:ascii="Arial" w:hAnsi="Arial" w:cs="Arial"/>
+          <w:sz w:val="20"/>
+          <w:szCs w:val="20"/>
+          <w:lang w:val="en-SG"/>
+        </w:rPr>
+      </w:pPr>
+      <w:r>
+        <w:rPr>
+          <w:rFonts w:ascii="Arial" w:hAnsi="Arial" w:cs="Arial"/>
+          <w:sz w:val="20"/>
+          <w:szCs w:val="20"/>
+          <w:lang w:val="en-SG"/>
+        </w:rPr>
+        <w:t>The original and quantised models were evaluated on the same test dataset using Mean Absolute Error (MAE), Root Mean Squared Error (RMSE), and the coefficient of determination (R²).</w:t>
+      </w:r>
+      <w:r>
+        <w:rPr>
+          <w:rFonts w:ascii="Arial" w:hAnsi="Arial" w:cs="Arial"/>
+          <w:sz w:val="20"/>
+          <w:szCs w:val="20"/>
+          <w:lang w:val="en-SG"/>
+        </w:rPr>
+        <w:t xml:space="preserve"> </w:t>
+      </w:r>
+      <w:r>
+        <w:rPr>
+          <w:rFonts w:ascii="Arial" w:hAnsi="Arial" w:cs="Arial"/>
+          <w:sz w:val="20"/>
+          <w:szCs w:val="20"/>
+          <w:lang w:val="en-SG"/>
+        </w:rPr>
+        <w:t>The original ANN achieved an MAE of 70,441.2323, an RMSE of 101,406.8166, and an R² of -2,566.7752. Following quantisation, the corresponding values were 70,441.2311, 101,406.8158, and -2,566.7751. The mean absolute difference between the original and quantised predictions was only 0.0093, indicating that quantisation had a negligible effect on the model's predictions.</w:t>
+      </w:r>
+    </w:p>
+    <w:p>
+      <w:pPr>
+        <w:jc w:val="center"/>
+        <w:rPr>
+          <w:rFonts w:ascii="Arial" w:hAnsi="Arial" w:cs="Arial"/>
+          <w:sz w:val="20"/>
+          <w:szCs w:val="20"/>
+          <w:lang w:val="en-SG"/>
+        </w:rPr>
+      </w:pPr>
+      <w:r>
+        <w:rPr>
+          <w:rFonts w:ascii="Arial" w:hAnsi="Arial" w:cs="Arial"/>
+          <w:sz w:val="20"/>
+          <w:szCs w:val="20"/>
+          <w:lang w:val="en-SG"/>
+        </w:rPr>
+        <w:drawing>
+          <wp:inline distT="0" distB="0" distL="0" distR="0" wp14:anchorId="05AA60CD" wp14:editId="77C0E258">
+            <wp:extent cx="3165841" cy="1549400"/>
+            <wp:effectExtent l="0" t="0" r="0" b="0"/>
+            <wp:docPr id="1600576524" name="Picture 1"/>
+            <wp:cNvGraphicFramePr>
+              <a:graphicFrameLocks xmlns:a="http://schemas.openxmlformats.org/drawingml/2006/main" noChangeAspect="1"/>
+            </wp:cNvGraphicFramePr>
+            <a:graphic xmlns:a="http://schemas.openxmlformats.org/drawingml/2006/main">
+              <a:graphicData uri="http://schemas.openxmlformats.org/drawingml/2006/picture">
+                <pic:pic xmlns:pic="http://schemas.openxmlformats.org/drawingml/2006/picture">
+                  <pic:nvPicPr>
+                    <pic:cNvPr id="1600576524" name=""/>
+                    <pic:cNvPicPr/>
+                  </pic:nvPicPr>
+                  <pic:blipFill>
+                    <a:blip r:embed="rId10"/>
+                    <a:stretch>
+                      <a:fillRect/>
+                    </a:stretch>
+                  </pic:blipFill>
+                  <pic:spPr>
+                    <a:xfrm>
+                      <a:off x="0" y="0"/>
+                      <a:ext cx="3169755" cy="1551316"/>
+                    </a:xfrm>
+                    <a:prstGeom prst="rect">
+                      <a:avLst/>
+                    </a:prstGeom>
+                  </pic:spPr>
+                </pic:pic>
+              </a:graphicData>
+            </a:graphic>
+          </wp:inline>
+        </w:drawing>
+      </w:r>
+    </w:p>
+    <w:p>
+      <w:pPr>
+        <w:rPr>
+          <w:rFonts w:ascii="Arial" w:hAnsi="Arial" w:cs="Arial"/>
+          <w:sz w:val="20"/>
+          <w:szCs w:val="20"/>
+          <w:lang w:val="en-SG"/>
+        </w:rPr>
+      </w:pPr>
+      <w:r>
+        <w:rPr>
+          <w:rFonts w:ascii="Arial" w:hAnsi="Arial" w:cs="Arial"/>
+          <w:sz w:val="20"/>
+          <w:szCs w:val="20"/>
+          <w:lang w:val="en-SG"/>
+        </w:rPr>
+        <w:t>These findings demonstrate that quantisation substantially reduces storage requirements while preserving the model's predictions, potentially making it more suitable for resource-constrained deployment.</w:t>
+      </w:r>
+    </w:p>
+    <w:p>
+      <w:pPr>
+        <w:rPr>
+          <w:rFonts w:ascii="Arial" w:hAnsi="Arial" w:cs="Arial"/>
+          <w:sz w:val="20"/>
+          <w:szCs w:val="20"/>
+          <w:lang w:val="en-SG"/>
+        </w:rPr>
+      </w:pPr>
+      <w:r>
+        <w:rPr>
+          <w:rFonts w:ascii="Arial" w:hAnsi="Arial" w:cs="Arial"/>
+          <w:sz w:val="20"/>
+          <w:szCs w:val="20"/>
+          <w:lang w:val="en-SG"/>
+        </w:rPr>
+        <w:t>However, quantisation does not inherently improve predictive accuracy, and inference speed improvements depend on the hardware and runtime environment. Furthermore, the strongly negative R² indicates that the underlying ANN performs poorly compared with a baseline that predicts the mean target value. Therefore, the model requires further performance optimisation before practical deployment. The evaluation also did not establish any improvement in inference speed or energy consumption, which would require separate benchmarking.</w:t>
+      </w:r>
+    </w:p>
+    <w:p>
+      <w:pPr>
+        <w:rPr>
+          <w:rFonts w:ascii="Arial" w:hAnsi="Arial" w:cs="Arial"/>
+          <w:sz w:val="20"/>
+          <w:szCs w:val="20"/>
           <w:lang w:val="en-PH"/>
         </w:rPr>
-        <w:t xml:space="preserve">Model </w:t>
-      </w:r>
-      <w:proofErr w:type="spellStart"/>
-      <w:r>
+      </w:pPr>
+    </w:p>
+    <w:p>
+      <w:pPr>
         <w:rPr>
           <w:rFonts w:ascii="Arial" w:hAnsi="Arial" w:cs="Arial"/>
           <w:b/>
@@ -4290,9 +4503,7 @@
           <w:szCs w:val="20"/>
           <w:lang w:val="en-PH"/>
         </w:rPr>
-        <w:t>quantisation</w:t>
-      </w:r>
-      <w:proofErr w:type="spellEnd"/>
+      </w:pPr>
       <w:r>
         <w:rPr>
           <w:rFonts w:ascii="Arial" w:hAnsi="Arial" w:cs="Arial"/>
@@ -4302,7 +4513,7 @@
           <w:szCs w:val="20"/>
           <w:lang w:val="en-PH"/>
         </w:rPr>
-        <w:t xml:space="preserve"> </w:t>
+        <w:t xml:space="preserve">GAN for synthetic traffic data </w:t>
       </w:r>
     </w:p>
     <w:p>
@@ -4321,7 +4532,36 @@
           <w:szCs w:val="20"/>
           <w:lang w:val="en-SG"/>
         </w:rPr>
-        <w:t>Original model:  35.79 KB</w:t>
+        <w:t xml:space="preserve">A Generative Adversarial Network (GAN) was implemented using TensorFlow and </w:t>
+      </w:r>
+      <w:proofErr w:type="spellStart"/>
+      <w:r>
+        <w:rPr>
+          <w:rFonts w:ascii="Arial" w:hAnsi="Arial" w:cs="Arial"/>
+          <w:sz w:val="20"/>
+          <w:szCs w:val="20"/>
+          <w:lang w:val="en-SG"/>
+        </w:rPr>
+        <w:t>Keras</w:t>
+      </w:r>
+      <w:proofErr w:type="spellEnd"/>
+      <w:r>
+        <w:rPr>
+          <w:rFonts w:ascii="Arial" w:hAnsi="Arial" w:cs="Arial"/>
+          <w:sz w:val="20"/>
+          <w:szCs w:val="20"/>
+          <w:lang w:val="en-SG"/>
+        </w:rPr>
+        <w:t xml:space="preserve"> to generate synthetic traffic data based on the statistical characteristics of the original dataset. The GAN consists of two neural networks: a Generator and a Discriminator. The Generator takes random noise as input and produces synthetic traffic records, while the Discriminator attempts to distinguish between real and generated records. Through adversarial training, the Generator learns to produce data that increasingly resembles the original traffic dataset.</w:t>
+      </w:r>
+      <w:r>
+        <w:rPr>
+          <w:rFonts w:ascii="Arial" w:hAnsi="Arial" w:cs="Arial"/>
+          <w:sz w:val="20"/>
+          <w:szCs w:val="20"/>
+          <w:lang w:val="en-SG"/>
+        </w:rPr>
+        <w:t xml:space="preserve">                                                                                                                                                                                                                                                                                                                                                                                                                                                                                                                                                                                                                                                                                             </w:t>
       </w:r>
     </w:p>
     <w:p>
@@ -4340,7 +4580,35 @@
           <w:szCs w:val="20"/>
           <w:lang w:val="en-SG"/>
         </w:rPr>
-        <w:t>Quantized model: 3.14 KB</w:t>
+        <w:t>Before training, numerical features were selected</w:t>
+      </w:r>
+      <w:r>
+        <w:rPr>
+          <w:rFonts w:ascii="Arial" w:hAnsi="Arial" w:cs="Arial"/>
+          <w:sz w:val="20"/>
+          <w:szCs w:val="20"/>
+          <w:lang w:val="en-SG"/>
+        </w:rPr>
+        <w:t xml:space="preserve"> </w:t>
+      </w:r>
+      <w:r>
+        <w:rPr>
+          <w:rFonts w:ascii="Arial" w:hAnsi="Arial" w:cs="Arial"/>
+          <w:sz w:val="20"/>
+          <w:szCs w:val="20"/>
+          <w:lang w:val="en-SG"/>
+        </w:rPr>
+        <w:t xml:space="preserve">and the data was scaled to the range [-1, 1]. The GAN was trained iteratively by updating the Discriminator to classify real and synthetic records and training the Generator to produce records that could deceive the Discriminator. After training, the </w:t>
+      </w:r>
+      <w:r>
+        <w:rPr>
+          <w:rFonts w:ascii="Arial" w:hAnsi="Arial" w:cs="Arial"/>
+          <w:sz w:val="20"/>
+          <w:szCs w:val="20"/>
+          <w:lang w:val="en-SG"/>
+        </w:rPr>
+        <w:lastRenderedPageBreak/>
+        <w:t>Generator was used to create 5,000 synthetic traffic observations, which were saved as a CSV file for further analysis and potential data augmentation.</w:t>
       </w:r>
     </w:p>
     <w:p>
@@ -4359,385 +4627,44 @@
           <w:szCs w:val="20"/>
           <w:lang w:val="en-SG"/>
         </w:rPr>
-        <w:t>Size reduction:  91.22%</w:t>
+        <w:t>Limitations: The implemented GAN generates individual synthetic records rather than sequential traffic observations. Consequently, it may not preserve temporal dependencies, such as traffic patterns across consecutive hours or days. Furthermore, the generated data may contain unrealistic feature combinations, invalid categorical values, or distributions that differ from the original dataset. GAN training can also be unstable</w:t>
+      </w:r>
+      <w:r>
+        <w:rPr>
+          <w:rFonts w:ascii="Arial" w:hAnsi="Arial" w:cs="Arial"/>
+          <w:sz w:val="20"/>
+          <w:szCs w:val="20"/>
+          <w:lang w:val="en-SG"/>
+        </w:rPr>
+        <w:t xml:space="preserve"> </w:t>
+      </w:r>
+      <w:r>
+        <w:rPr>
+          <w:rFonts w:ascii="Arial" w:hAnsi="Arial" w:cs="Arial"/>
+          <w:sz w:val="20"/>
+          <w:szCs w:val="20"/>
+          <w:lang w:val="en-SG"/>
+        </w:rPr>
+        <w:t>where the Generator produces limited varieties of data. Finally, the quality and usefulness of the synthetic data must be evaluated by comparing feature distributions, correlations, and traffic patterns against the original dataset. Its effectiveness for improving traffic prediction should be confirmed by evaluating the prediction model on an independent, chronological test set.</w:t>
       </w:r>
     </w:p>
     <w:p>
       <w:pPr>
-        <w:rPr>
-          <w:rFonts w:ascii="Arial" w:hAnsi="Arial" w:cs="Arial"/>
-          <w:b/>
-          <w:bCs/>
+        <w:jc w:val="center"/>
+        <w:rPr>
+          <w:rFonts w:ascii="Arial" w:hAnsi="Arial" w:cs="Arial"/>
           <w:sz w:val="20"/>
           <w:szCs w:val="20"/>
           <w:lang w:val="en-PH"/>
         </w:rPr>
       </w:pPr>
-    </w:p>
-    <w:p>
-      <w:pPr>
+      <w:r>
         <w:rPr>
           <w:rFonts w:ascii="Arial" w:hAnsi="Arial" w:cs="Arial"/>
           <w:sz w:val="20"/>
           <w:szCs w:val="20"/>
           <w:lang w:val="en-PH"/>
         </w:rPr>
-      </w:pPr>
-      <w:r>
-        <w:rPr>
-          <w:rFonts w:ascii="Arial" w:hAnsi="Arial" w:cs="Arial"/>
-          <w:sz w:val="20"/>
-          <w:szCs w:val="20"/>
-          <w:lang w:val="en-PH"/>
-        </w:rPr>
-        <w:t xml:space="preserve">Done with dynamic range. </w:t>
-      </w:r>
-    </w:p>
-    <w:p>
-      <w:pPr>
-        <w:rPr>
-          <w:rFonts w:ascii="Arial" w:hAnsi="Arial" w:cs="Arial"/>
-          <w:sz w:val="20"/>
-          <w:szCs w:val="20"/>
-          <w:lang w:val="en-SG"/>
-        </w:rPr>
-      </w:pPr>
-      <w:r>
-        <w:rPr>
-          <w:rFonts w:ascii="Arial" w:hAnsi="Arial" w:cs="Arial"/>
-          <w:sz w:val="20"/>
-          <w:szCs w:val="20"/>
-          <w:lang w:val="en-SG"/>
-        </w:rPr>
-        <w:t>Original ANN</w:t>
-      </w:r>
-    </w:p>
-    <w:p>
-      <w:pPr>
-        <w:rPr>
-          <w:rFonts w:ascii="Arial" w:hAnsi="Arial" w:cs="Arial"/>
-          <w:sz w:val="20"/>
-          <w:szCs w:val="20"/>
-          <w:lang w:val="en-SG"/>
-        </w:rPr>
-      </w:pPr>
-      <w:r>
-        <w:rPr>
-          <w:rFonts w:ascii="Arial" w:hAnsi="Arial" w:cs="Arial"/>
-          <w:sz w:val="20"/>
-          <w:szCs w:val="20"/>
-          <w:lang w:val="en-SG"/>
-        </w:rPr>
-        <w:t>MAE:  70441.2323</w:t>
-      </w:r>
-    </w:p>
-    <w:p>
-      <w:pPr>
-        <w:rPr>
-          <w:rFonts w:ascii="Arial" w:hAnsi="Arial" w:cs="Arial"/>
-          <w:sz w:val="20"/>
-          <w:szCs w:val="20"/>
-          <w:lang w:val="en-SG"/>
-        </w:rPr>
-      </w:pPr>
-      <w:r>
-        <w:rPr>
-          <w:rFonts w:ascii="Arial" w:hAnsi="Arial" w:cs="Arial"/>
-          <w:sz w:val="20"/>
-          <w:szCs w:val="20"/>
-          <w:lang w:val="en-SG"/>
-        </w:rPr>
-        <w:t>RMSE: 101406.8166</w:t>
-      </w:r>
-    </w:p>
-    <w:p>
-      <w:pPr>
-        <w:rPr>
-          <w:rFonts w:ascii="Arial" w:hAnsi="Arial" w:cs="Arial"/>
-          <w:sz w:val="20"/>
-          <w:szCs w:val="20"/>
-          <w:lang w:val="en-SG"/>
-        </w:rPr>
-      </w:pPr>
-      <w:r>
-        <w:rPr>
-          <w:rFonts w:ascii="Arial" w:hAnsi="Arial" w:cs="Arial"/>
-          <w:sz w:val="20"/>
-          <w:szCs w:val="20"/>
-          <w:lang w:val="en-SG"/>
-        </w:rPr>
-        <w:t>R²:   -2566.7752</w:t>
-      </w:r>
-    </w:p>
-    <w:p>
-      <w:pPr>
-        <w:rPr>
-          <w:rFonts w:ascii="Arial" w:hAnsi="Arial" w:cs="Arial"/>
-          <w:sz w:val="20"/>
-          <w:szCs w:val="20"/>
-          <w:lang w:val="en-SG"/>
-        </w:rPr>
-      </w:pPr>
-    </w:p>
-    <w:p>
-      <w:pPr>
-        <w:rPr>
-          <w:rFonts w:ascii="Arial" w:hAnsi="Arial" w:cs="Arial"/>
-          <w:sz w:val="20"/>
-          <w:szCs w:val="20"/>
-          <w:lang w:val="en-SG"/>
-        </w:rPr>
-      </w:pPr>
-      <w:r>
-        <w:rPr>
-          <w:rFonts w:ascii="Arial" w:hAnsi="Arial" w:cs="Arial"/>
-          <w:sz w:val="20"/>
-          <w:szCs w:val="20"/>
-          <w:lang w:val="en-SG"/>
-        </w:rPr>
-        <w:t>Dynamic-Range Quantized ANN</w:t>
-      </w:r>
-    </w:p>
-    <w:p>
-      <w:pPr>
-        <w:rPr>
-          <w:rFonts w:ascii="Arial" w:hAnsi="Arial" w:cs="Arial"/>
-          <w:sz w:val="20"/>
-          <w:szCs w:val="20"/>
-          <w:lang w:val="en-SG"/>
-        </w:rPr>
-      </w:pPr>
-      <w:r>
-        <w:rPr>
-          <w:rFonts w:ascii="Arial" w:hAnsi="Arial" w:cs="Arial"/>
-          <w:sz w:val="20"/>
-          <w:szCs w:val="20"/>
-          <w:lang w:val="en-SG"/>
-        </w:rPr>
-        <w:t>MAE:  70441.2311</w:t>
-      </w:r>
-    </w:p>
-    <w:p>
-      <w:pPr>
-        <w:rPr>
-          <w:rFonts w:ascii="Arial" w:hAnsi="Arial" w:cs="Arial"/>
-          <w:sz w:val="20"/>
-          <w:szCs w:val="20"/>
-          <w:lang w:val="en-SG"/>
-        </w:rPr>
-      </w:pPr>
-      <w:r>
-        <w:rPr>
-          <w:rFonts w:ascii="Arial" w:hAnsi="Arial" w:cs="Arial"/>
-          <w:sz w:val="20"/>
-          <w:szCs w:val="20"/>
-          <w:lang w:val="en-SG"/>
-        </w:rPr>
-        <w:t>RMSE: 101406.8158</w:t>
-      </w:r>
-    </w:p>
-    <w:p>
-      <w:pPr>
-        <w:rPr>
-          <w:rFonts w:ascii="Arial" w:hAnsi="Arial" w:cs="Arial"/>
-          <w:sz w:val="20"/>
-          <w:szCs w:val="20"/>
-          <w:lang w:val="en-SG"/>
-        </w:rPr>
-      </w:pPr>
-      <w:r>
-        <w:rPr>
-          <w:rFonts w:ascii="Arial" w:hAnsi="Arial" w:cs="Arial"/>
-          <w:sz w:val="20"/>
-          <w:szCs w:val="20"/>
-          <w:lang w:val="en-SG"/>
-        </w:rPr>
-        <w:t>R²:   -2566.7751</w:t>
-      </w:r>
-    </w:p>
-    <w:p>
-      <w:pPr>
-        <w:rPr>
-          <w:rFonts w:ascii="Arial" w:hAnsi="Arial" w:cs="Arial"/>
-          <w:sz w:val="20"/>
-          <w:szCs w:val="20"/>
-          <w:lang w:val="en-SG"/>
-        </w:rPr>
-      </w:pPr>
-      <w:r>
-        <w:rPr>
-          <w:rFonts w:ascii="Arial" w:hAnsi="Arial" w:cs="Arial"/>
-          <w:sz w:val="20"/>
-          <w:szCs w:val="20"/>
-          <w:lang w:val="en-SG"/>
-        </w:rPr>
-        <w:t>Mean absolute prediction difference: 0.009316239</w:t>
-      </w:r>
-    </w:p>
-    <w:p>
-      <w:pPr>
-        <w:rPr>
-          <w:rFonts w:ascii="Arial" w:hAnsi="Arial" w:cs="Arial"/>
-          <w:sz w:val="20"/>
-          <w:szCs w:val="20"/>
-          <w:lang w:val="en-PH"/>
-        </w:rPr>
-      </w:pPr>
-    </w:p>
-    <w:p>
-      <w:pPr>
-        <w:rPr>
-          <w:rFonts w:ascii="Arial" w:hAnsi="Arial" w:cs="Arial"/>
-          <w:b/>
-          <w:bCs/>
-          <w:sz w:val="20"/>
-          <w:szCs w:val="20"/>
-          <w:lang w:val="en-PH"/>
-        </w:rPr>
-      </w:pPr>
-      <w:r>
-        <w:rPr>
-          <w:rFonts w:ascii="Arial" w:hAnsi="Arial" w:cs="Arial"/>
-          <w:b/>
-          <w:bCs/>
-          <w:sz w:val="20"/>
-          <w:szCs w:val="20"/>
-          <w:lang w:val="en-PH"/>
-        </w:rPr>
-        <w:t xml:space="preserve">GAN for synthetic traffic data </w:t>
-      </w:r>
-    </w:p>
-    <w:p>
-      <w:pPr>
-        <w:rPr>
-          <w:rFonts w:ascii="Arial" w:hAnsi="Arial" w:cs="Arial"/>
-          <w:sz w:val="20"/>
-          <w:szCs w:val="20"/>
-          <w:lang w:val="en-SG"/>
-        </w:rPr>
-      </w:pPr>
-      <w:r>
-        <w:rPr>
-          <w:rFonts w:ascii="Arial" w:hAnsi="Arial" w:cs="Arial"/>
-          <w:sz w:val="20"/>
-          <w:szCs w:val="20"/>
-          <w:lang w:val="en-SG"/>
-        </w:rPr>
-        <w:t xml:space="preserve">A Generative Adversarial Network (GAN) was implemented using TensorFlow and </w:t>
-      </w:r>
-      <w:proofErr w:type="spellStart"/>
-      <w:r>
-        <w:rPr>
-          <w:rFonts w:ascii="Arial" w:hAnsi="Arial" w:cs="Arial"/>
-          <w:sz w:val="20"/>
-          <w:szCs w:val="20"/>
-          <w:lang w:val="en-SG"/>
-        </w:rPr>
-        <w:t>Keras</w:t>
-      </w:r>
-      <w:proofErr w:type="spellEnd"/>
-      <w:r>
-        <w:rPr>
-          <w:rFonts w:ascii="Arial" w:hAnsi="Arial" w:cs="Arial"/>
-          <w:sz w:val="20"/>
-          <w:szCs w:val="20"/>
-          <w:lang w:val="en-SG"/>
-        </w:rPr>
-        <w:t xml:space="preserve"> to generate synthetic traffic data based on the statistical characteristics of the original dataset. The GAN consists of two neural networks: a Generator and a Discriminator. The Generator takes random noise as input and produces synthetic traffic records, while the Discriminator attempts to distinguish between real and generated records. Through adversarial training, the Generator learns to produce data that increasingly resembles the original traffic dataset.</w:t>
-      </w:r>
-    </w:p>
-    <w:p>
-      <w:pPr>
-        <w:rPr>
-          <w:rFonts w:ascii="Arial" w:hAnsi="Arial" w:cs="Arial"/>
-          <w:sz w:val="20"/>
-          <w:szCs w:val="20"/>
-          <w:lang w:val="en-SG"/>
-        </w:rPr>
-      </w:pPr>
-      <w:r>
-        <w:rPr>
-          <w:rFonts w:ascii="Arial" w:hAnsi="Arial" w:cs="Arial"/>
-          <w:sz w:val="20"/>
-          <w:szCs w:val="20"/>
-          <w:lang w:val="en-SG"/>
-        </w:rPr>
-        <w:t>Before training, numerical features were selected</w:t>
-      </w:r>
-      <w:r>
-        <w:rPr>
-          <w:rFonts w:ascii="Arial" w:hAnsi="Arial" w:cs="Arial"/>
-          <w:sz w:val="20"/>
-          <w:szCs w:val="20"/>
-          <w:lang w:val="en-SG"/>
-        </w:rPr>
-        <w:t xml:space="preserve"> </w:t>
-      </w:r>
-      <w:r>
-        <w:rPr>
-          <w:rFonts w:ascii="Arial" w:hAnsi="Arial" w:cs="Arial"/>
-          <w:sz w:val="20"/>
-          <w:szCs w:val="20"/>
-          <w:lang w:val="en-SG"/>
-        </w:rPr>
-        <w:t>and the data was scaled to the range [-1, 1]. The GAN was trained iteratively by updating the Discriminator to classify real and synthetic records and training the Generator to produce records that could deceive the Discriminator. After training, the Generator was used to create 5,000 synthetic traffic observations, which were saved as a CSV file for further analysis and potential data augmentation.</w:t>
-      </w:r>
-    </w:p>
-    <w:p>
-      <w:pPr>
-        <w:rPr>
-          <w:rFonts w:ascii="Arial" w:hAnsi="Arial" w:cs="Arial"/>
-          <w:sz w:val="20"/>
-          <w:szCs w:val="20"/>
-          <w:lang w:val="en-SG"/>
-        </w:rPr>
-      </w:pPr>
-      <w:r>
-        <w:rPr>
-          <w:rFonts w:ascii="Arial" w:hAnsi="Arial" w:cs="Arial"/>
-          <w:sz w:val="20"/>
-          <w:szCs w:val="20"/>
-          <w:lang w:val="en-SG"/>
-        </w:rPr>
-        <w:t>Limitations: The implemented GAN generates individual synthetic records rather than sequential traffic observations. Consequently, it may not preserve temporal dependencies, such as traffic patterns across consecutive hours or days. Furthermore, the generated data may contain unrealistic feature combinations, invalid categorical values, or distributions that differ from the original dataset. GAN training can also be unstable</w:t>
-      </w:r>
-      <w:r>
-        <w:rPr>
-          <w:rFonts w:ascii="Arial" w:hAnsi="Arial" w:cs="Arial"/>
-          <w:sz w:val="20"/>
-          <w:szCs w:val="20"/>
-          <w:lang w:val="en-SG"/>
-        </w:rPr>
-        <w:t xml:space="preserve"> </w:t>
-      </w:r>
-      <w:r>
-        <w:rPr>
-          <w:rFonts w:ascii="Arial" w:hAnsi="Arial" w:cs="Arial"/>
-          <w:sz w:val="20"/>
-          <w:szCs w:val="20"/>
-          <w:lang w:val="en-SG"/>
-        </w:rPr>
-        <w:t>where the Generator produces limited varieties of data. Finally, the quality and usefulness of the synthetic data must be evaluated by comparing feature distributions, correlations, and traffic patterns against the original dataset. Its effectiveness for improving traffic prediction should be confirmed by evaluating the prediction model on an independent, chronological test set.</w:t>
-      </w:r>
-    </w:p>
-    <w:p>
-      <w:pPr>
-        <w:jc w:val="center"/>
-        <w:rPr>
-          <w:rFonts w:ascii="Arial" w:hAnsi="Arial" w:cs="Arial"/>
-          <w:sz w:val="20"/>
-          <w:szCs w:val="20"/>
-          <w:lang w:val="en-PH"/>
-        </w:rPr>
-      </w:pPr>
-      <w:r>
-        <w:rPr>
-          <w:rFonts w:ascii="Arial" w:hAnsi="Arial" w:cs="Arial"/>
-          <w:sz w:val="20"/>
-          <w:szCs w:val="20"/>
-          <w:lang w:val="en-PH"/>
-        </w:rPr>
-        <w:lastRenderedPageBreak/>
         <w:drawing>
           <wp:inline distT="0" distB="0" distL="0" distR="0" wp14:anchorId="463730A6" wp14:editId="37867633">
             <wp:extent cx="3463621" cy="2473960"/>
@@ -4754,7 +4681,7 @@
                     <pic:cNvPicPr/>
                   </pic:nvPicPr>
                   <pic:blipFill>
-                    <a:blip r:embed="rId9"/>
+                    <a:blip r:embed="rId11"/>
                     <a:stretch>
                       <a:fillRect/>
                     </a:stretch>
@@ -4872,6 +4799,7 @@
           <w:szCs w:val="20"/>
           <w:lang w:val="en-PH"/>
         </w:rPr>
+        <w:lastRenderedPageBreak/>
         <w:drawing>
           <wp:inline distT="0" distB="0" distL="0" distR="0" wp14:anchorId="313917A0" wp14:editId="726C2F63">
             <wp:extent cx="5731510" cy="1388745"/>
@@ -4888,7 +4816,7 @@
                     <pic:cNvPicPr/>
                   </pic:nvPicPr>
                   <pic:blipFill>
-                    <a:blip r:embed="rId10"/>
+                    <a:blip r:embed="rId12"/>
                     <a:stretch>
                       <a:fillRect/>
                     </a:stretch>
@@ -5081,7 +5009,6 @@
           <w:szCs w:val="20"/>
           <w:lang w:val="en-SG"/>
         </w:rPr>
-        <w:lastRenderedPageBreak/>
         <w:t>Several data-related limitations and potential sources of bias must be considered when interpreting the model's predictions and assessing its suitability for real-world traffic applications.</w:t>
       </w:r>
     </w:p>
@@ -5345,6 +5272,7 @@
           <w:szCs w:val="20"/>
           <w:lang w:val="en-SG"/>
         </w:rPr>
+        <w:lastRenderedPageBreak/>
         <w:t>Governance and human oversight.</w:t>
       </w:r>
       <w:r>
@@ -5403,17 +5331,7 @@
           <w:szCs w:val="20"/>
           <w:lang w:val="en-SG"/>
         </w:rPr>
-        <w:t xml:space="preserve"> Developing and deploying AI models involves trade-offs between predictive performance and computational resource consumption. Training more </w:t>
-      </w:r>
-      <w:r>
-        <w:rPr>
-          <w:rFonts w:ascii="Arial" w:hAnsi="Arial" w:cs="Arial"/>
-          <w:sz w:val="20"/>
-          <w:szCs w:val="20"/>
-          <w:lang w:val="en-SG"/>
-        </w:rPr>
-        <w:lastRenderedPageBreak/>
-        <w:t>complex models or increasing the number of epochs can require additional electricity, computing capacity, and associated infrastructure resources. Data centres also consume water for cooling, while electricity generation may contribute to greenhouse gas emissions depending on the energy source.</w:t>
+        <w:t xml:space="preserve"> Developing and deploying AI models involves trade-offs between predictive performance and computational resource consumption. Training more complex models or increasing the number of epochs can require additional electricity, computing capacity, and associated infrastructure resources. Data centres also consume water for cooling, while electricity generation may contribute to greenhouse gas emissions depending on the energy source.</w:t>
       </w:r>
     </w:p>
     <w:p>

</xml_diff>